<commit_message>
Fix leakage bug in ML Pipelines (impute after split, not before) + add traditional-vs-pipeline comparison
The manual path imputed missing values on the full dataset before
splitting, letting test rows quietly inform training-time fill values.
Fixed by splitting first, then computing median/mode from the training
split only, applying those exact values to both splits (encoding now
uses get_dummies + reindex to keep columns aligned). Step 4 now reuses
Step 1's split instead of re-splitting redundantly. Verified the pipeline
still reproduces the selected model's result exactly (82.7%/84.1% recall).

Also adds a "Traditional Method vs. Pipeline" comparison section to both
the notebook and Teaching Notes, covering leakage risk, deployment,
tuning, and the debugging-visibility trade-off -- using this exact
leakage bug as the concrete example.
</commit_message>
<xml_diff>
--- a/ML Pipelines/ML Pipelines Teaching Notes.docx
+++ b/ML Pipelines/ML Pipelines Teaching Notes.docx
@@ -64,7 +64,7 @@
         <w:pStyle w:val="Heading1"/>
         <w:spacing w:before="400" w:after="200"/>
       </w:pPr>
-      <w:bookmarkStart w:id="0" w:name="_Toc239079444"/>
+      <w:bookmarkStart w:id="0" w:name="_Toc239080346"/>
       <w:r>
         <w:rPr>
           <w:b/>
@@ -79,7 +79,7 @@
     <w:sdt>
       <w:sdtPr>
         <w:alias w:val="Contents"/>
-        <w:id w:val="-1689361606"/>
+        <w:id w:val="-1774618315"/>
       </w:sdtPr>
       <w:sdtEndPr/>
       <w:sdtContent>
@@ -107,7 +107,7 @@
           <w:r>
             <w:fldChar w:fldCharType="separate"/>
           </w:r>
-          <w:hyperlink w:anchor="_Toc239079444" w:history="1">
+          <w:hyperlink w:anchor="_Toc239080346" w:history="1">
             <w:r>
               <w:rPr>
                 <w:rStyle w:val="Hyperlink"/>
@@ -133,7 +133,7 @@
               <w:rPr>
                 <w:noProof/>
               </w:rPr>
-              <w:instrText xml:space="preserve"> PAGEREF _Toc239079444 \h </w:instrText>
+              <w:instrText xml:space="preserve"> PAGEREF _Toc239080346 \h </w:instrText>
             </w:r>
             <w:r>
               <w:rPr>
@@ -175,7 +175,7 @@
               <w14:ligatures w14:val="standardContextual"/>
             </w:rPr>
           </w:pPr>
-          <w:hyperlink w:anchor="_Toc239079445" w:history="1">
+          <w:hyperlink w:anchor="_Toc239080347" w:history="1">
             <w:r>
               <w:rPr>
                 <w:rStyle w:val="Hyperlink"/>
@@ -201,7 +201,7 @@
               <w:rPr>
                 <w:noProof/>
               </w:rPr>
-              <w:instrText xml:space="preserve"> PAGEREF _Toc239079445 \h </w:instrText>
+              <w:instrText xml:space="preserve"> PAGEREF _Toc239080347 \h </w:instrText>
             </w:r>
             <w:r>
               <w:rPr>
@@ -243,7 +243,7 @@
               <w14:ligatures w14:val="standardContextual"/>
             </w:rPr>
           </w:pPr>
-          <w:hyperlink w:anchor="_Toc239079446" w:history="1">
+          <w:hyperlink w:anchor="_Toc239080348" w:history="1">
             <w:r>
               <w:rPr>
                 <w:rStyle w:val="Hyperlink"/>
@@ -269,7 +269,7 @@
               <w:rPr>
                 <w:noProof/>
               </w:rPr>
-              <w:instrText xml:space="preserve"> PAGEREF _Toc239079446 \h </w:instrText>
+              <w:instrText xml:space="preserve"> PAGEREF _Toc239080348 \h </w:instrText>
             </w:r>
             <w:r>
               <w:rPr>
@@ -311,7 +311,7 @@
               <w14:ligatures w14:val="standardContextual"/>
             </w:rPr>
           </w:pPr>
-          <w:hyperlink w:anchor="_Toc239079447" w:history="1">
+          <w:hyperlink w:anchor="_Toc239080349" w:history="1">
             <w:r>
               <w:rPr>
                 <w:rStyle w:val="Hyperlink"/>
@@ -319,7 +319,7 @@
                 <w:bCs/>
                 <w:noProof/>
               </w:rPr>
-              <w:t>Step 1: Engineer, Impute, Encode, Train</w:t>
+              <w:t>Step 1: Split, Then Engineer, Impute, Encode, Train</w:t>
             </w:r>
             <w:r>
               <w:rPr>
@@ -337,7 +337,7 @@
               <w:rPr>
                 <w:noProof/>
               </w:rPr>
-              <w:instrText xml:space="preserve"> PAGEREF _Toc239079447 \h </w:instrText>
+              <w:instrText xml:space="preserve"> PAGEREF _Toc239080349 \h </w:instrText>
             </w:r>
             <w:r>
               <w:rPr>
@@ -379,7 +379,7 @@
               <w14:ligatures w14:val="standardContextual"/>
             </w:rPr>
           </w:pPr>
-          <w:hyperlink w:anchor="_Toc239079448" w:history="1">
+          <w:hyperlink w:anchor="_Toc239080350" w:history="1">
             <w:r>
               <w:rPr>
                 <w:rStyle w:val="Hyperlink"/>
@@ -405,7 +405,7 @@
               <w:rPr>
                 <w:noProof/>
               </w:rPr>
-              <w:instrText xml:space="preserve"> PAGEREF _Toc239079448 \h </w:instrText>
+              <w:instrText xml:space="preserve"> PAGEREF _Toc239080350 \h </w:instrText>
             </w:r>
             <w:r>
               <w:rPr>
@@ -447,7 +447,7 @@
               <w14:ligatures w14:val="standardContextual"/>
             </w:rPr>
           </w:pPr>
-          <w:hyperlink w:anchor="_Toc239079449" w:history="1">
+          <w:hyperlink w:anchor="_Toc239080351" w:history="1">
             <w:r>
               <w:rPr>
                 <w:rStyle w:val="Hyperlink"/>
@@ -473,7 +473,7 @@
               <w:rPr>
                 <w:noProof/>
               </w:rPr>
-              <w:instrText xml:space="preserve"> PAGEREF _Toc239079449 \h </w:instrText>
+              <w:instrText xml:space="preserve"> PAGEREF _Toc239080351 \h </w:instrText>
             </w:r>
             <w:r>
               <w:rPr>
@@ -515,7 +515,7 @@
               <w14:ligatures w14:val="standardContextual"/>
             </w:rPr>
           </w:pPr>
-          <w:hyperlink w:anchor="_Toc239079450" w:history="1">
+          <w:hyperlink w:anchor="_Toc239080352" w:history="1">
             <w:r>
               <w:rPr>
                 <w:rStyle w:val="Hyperlink"/>
@@ -541,7 +541,7 @@
               <w:rPr>
                 <w:noProof/>
               </w:rPr>
-              <w:instrText xml:space="preserve"> PAGEREF _Toc239079450 \h </w:instrText>
+              <w:instrText xml:space="preserve"> PAGEREF _Toc239080352 \h </w:instrText>
             </w:r>
             <w:r>
               <w:rPr>
@@ -583,7 +583,7 @@
               <w14:ligatures w14:val="standardContextual"/>
             </w:rPr>
           </w:pPr>
-          <w:hyperlink w:anchor="_Toc239079451" w:history="1">
+          <w:hyperlink w:anchor="_Toc239080353" w:history="1">
             <w:r>
               <w:rPr>
                 <w:rStyle w:val="Hyperlink"/>
@@ -609,7 +609,7 @@
               <w:rPr>
                 <w:noProof/>
               </w:rPr>
-              <w:instrText xml:space="preserve"> PAGEREF _Toc239079451 \h </w:instrText>
+              <w:instrText xml:space="preserve"> PAGEREF _Toc239080353 \h </w:instrText>
             </w:r>
             <w:r>
               <w:rPr>
@@ -651,7 +651,7 @@
               <w14:ligatures w14:val="standardContextual"/>
             </w:rPr>
           </w:pPr>
-          <w:hyperlink w:anchor="_Toc239079452" w:history="1">
+          <w:hyperlink w:anchor="_Toc239080354" w:history="1">
             <w:r>
               <w:rPr>
                 <w:rStyle w:val="Hyperlink"/>
@@ -677,7 +677,7 @@
               <w:rPr>
                 <w:noProof/>
               </w:rPr>
-              <w:instrText xml:space="preserve"> PAGEREF _Toc239079452 \h </w:instrText>
+              <w:instrText xml:space="preserve"> PAGEREF _Toc239080354 \h </w:instrText>
             </w:r>
             <w:r>
               <w:rPr>
@@ -719,7 +719,7 @@
               <w14:ligatures w14:val="standardContextual"/>
             </w:rPr>
           </w:pPr>
-          <w:hyperlink w:anchor="_Toc239079453" w:history="1">
+          <w:hyperlink w:anchor="_Toc239080355" w:history="1">
             <w:r>
               <w:rPr>
                 <w:rStyle w:val="Hyperlink"/>
@@ -745,7 +745,7 @@
               <w:rPr>
                 <w:noProof/>
               </w:rPr>
-              <w:instrText xml:space="preserve"> PAGEREF _Toc239079453 \h </w:instrText>
+              <w:instrText xml:space="preserve"> PAGEREF _Toc239080355 \h </w:instrText>
             </w:r>
             <w:r>
               <w:rPr>
@@ -787,7 +787,7 @@
               <w14:ligatures w14:val="standardContextual"/>
             </w:rPr>
           </w:pPr>
-          <w:hyperlink w:anchor="_Toc239079454" w:history="1">
+          <w:hyperlink w:anchor="_Toc239080356" w:history="1">
             <w:r>
               <w:rPr>
                 <w:rStyle w:val="Hyperlink"/>
@@ -795,7 +795,7 @@
                 <w:bCs/>
                 <w:noProof/>
               </w:rPr>
-              <w:t>7. Practical Guidance</w:t>
+              <w:t>7. Traditional Method vs. Pipeline: Side by Side</w:t>
             </w:r>
             <w:r>
               <w:rPr>
@@ -813,7 +813,7 @@
               <w:rPr>
                 <w:noProof/>
               </w:rPr>
-              <w:instrText xml:space="preserve"> PAGEREF _Toc239079454 \h </w:instrText>
+              <w:instrText xml:space="preserve"> PAGEREF _Toc239080356 \h </w:instrText>
             </w:r>
             <w:r>
               <w:rPr>
@@ -855,7 +855,7 @@
               <w14:ligatures w14:val="standardContextual"/>
             </w:rPr>
           </w:pPr>
-          <w:hyperlink w:anchor="_Toc239079455" w:history="1">
+          <w:hyperlink w:anchor="_Toc239080357" w:history="1">
             <w:r>
               <w:rPr>
                 <w:rStyle w:val="Hyperlink"/>
@@ -863,6 +863,74 @@
                 <w:bCs/>
                 <w:noProof/>
               </w:rPr>
+              <w:t>8. Practical Guidance</w:t>
+            </w:r>
+            <w:r>
+              <w:rPr>
+                <w:noProof/>
+              </w:rPr>
+              <w:tab/>
+            </w:r>
+            <w:r>
+              <w:rPr>
+                <w:noProof/>
+              </w:rPr>
+              <w:fldChar w:fldCharType="begin"/>
+            </w:r>
+            <w:r>
+              <w:rPr>
+                <w:noProof/>
+              </w:rPr>
+              <w:instrText xml:space="preserve"> PAGEREF _Toc239080357 \h </w:instrText>
+            </w:r>
+            <w:r>
+              <w:rPr>
+                <w:noProof/>
+              </w:rPr>
+            </w:r>
+            <w:r>
+              <w:rPr>
+                <w:noProof/>
+              </w:rPr>
+              <w:fldChar w:fldCharType="separate"/>
+            </w:r>
+            <w:r>
+              <w:rPr>
+                <w:noProof/>
+              </w:rPr>
+              <w:t>7</w:t>
+            </w:r>
+            <w:r>
+              <w:rPr>
+                <w:noProof/>
+              </w:rPr>
+              <w:fldChar w:fldCharType="end"/>
+            </w:r>
+          </w:hyperlink>
+        </w:p>
+        <w:p>
+          <w:pPr>
+            <w:pStyle w:val="TOC1"/>
+            <w:tabs>
+              <w:tab w:val="right" w:leader="dot" w:pos="9016"/>
+            </w:tabs>
+            <w:rPr>
+              <w:rFonts w:asciiTheme="minorHAnsi" w:eastAsiaTheme="minorEastAsia" w:hAnsiTheme="minorHAnsi" w:cstheme="minorBidi"/>
+              <w:noProof/>
+              <w:kern w:val="2"/>
+              <w:sz w:val="24"/>
+              <w:szCs w:val="24"/>
+              <w14:ligatures w14:val="standardContextual"/>
+            </w:rPr>
+          </w:pPr>
+          <w:hyperlink w:anchor="_Toc239080358" w:history="1">
+            <w:r>
+              <w:rPr>
+                <w:rStyle w:val="Hyperlink"/>
+                <w:b/>
+                <w:bCs/>
+                <w:noProof/>
+              </w:rPr>
               <w:t>Summary Cheat Sheet</w:t>
             </w:r>
             <w:r>
@@ -881,7 +949,7 @@
               <w:rPr>
                 <w:noProof/>
               </w:rPr>
-              <w:instrText xml:space="preserve"> PAGEREF _Toc239079455 \h </w:instrText>
+              <w:instrText xml:space="preserve"> PAGEREF _Toc239080358 \h </w:instrText>
             </w:r>
             <w:r>
               <w:rPr>
@@ -923,7 +991,7 @@
               <w14:ligatures w14:val="standardContextual"/>
             </w:rPr>
           </w:pPr>
-          <w:hyperlink w:anchor="_Toc239079456" w:history="1">
+          <w:hyperlink w:anchor="_Toc239080359" w:history="1">
             <w:r>
               <w:rPr>
                 <w:rStyle w:val="Hyperlink"/>
@@ -949,7 +1017,7 @@
               <w:rPr>
                 <w:noProof/>
               </w:rPr>
-              <w:instrText xml:space="preserve"> PAGEREF _Toc239079456 \h </w:instrText>
+              <w:instrText xml:space="preserve"> PAGEREF _Toc239080359 \h </w:instrText>
             </w:r>
             <w:r>
               <w:rPr>
@@ -991,7 +1059,7 @@
               <w14:ligatures w14:val="standardContextual"/>
             </w:rPr>
           </w:pPr>
-          <w:hyperlink w:anchor="_Toc239079457" w:history="1">
+          <w:hyperlink w:anchor="_Toc239080360" w:history="1">
             <w:r>
               <w:rPr>
                 <w:rStyle w:val="Hyperlink"/>
@@ -1017,7 +1085,7 @@
               <w:rPr>
                 <w:noProof/>
               </w:rPr>
-              <w:instrText xml:space="preserve"> PAGEREF _Toc239079457 \h </w:instrText>
+              <w:instrText xml:space="preserve"> PAGEREF _Toc239080360 \h </w:instrText>
             </w:r>
             <w:r>
               <w:rPr>
@@ -1034,7 +1102,7 @@
               <w:rPr>
                 <w:noProof/>
               </w:rPr>
-              <w:t>7</w:t>
+              <w:t>8</w:t>
             </w:r>
             <w:r>
               <w:rPr>
@@ -1059,7 +1127,7 @@
               <w14:ligatures w14:val="standardContextual"/>
             </w:rPr>
           </w:pPr>
-          <w:hyperlink w:anchor="_Toc239079458" w:history="1">
+          <w:hyperlink w:anchor="_Toc239080361" w:history="1">
             <w:r>
               <w:rPr>
                 <w:rStyle w:val="Hyperlink"/>
@@ -1085,7 +1153,7 @@
               <w:rPr>
                 <w:noProof/>
               </w:rPr>
-              <w:instrText xml:space="preserve"> PAGEREF _Toc239079458 \h </w:instrText>
+              <w:instrText xml:space="preserve"> PAGEREF _Toc239080361 \h </w:instrText>
             </w:r>
             <w:r>
               <w:rPr>
@@ -1102,7 +1170,7 @@
               <w:rPr>
                 <w:noProof/>
               </w:rPr>
-              <w:t>7</w:t>
+              <w:t>8</w:t>
             </w:r>
             <w:r>
               <w:rPr>
@@ -1127,7 +1195,7 @@
               <w14:ligatures w14:val="standardContextual"/>
             </w:rPr>
           </w:pPr>
-          <w:hyperlink w:anchor="_Toc239079459" w:history="1">
+          <w:hyperlink w:anchor="_Toc239080362" w:history="1">
             <w:r>
               <w:rPr>
                 <w:rStyle w:val="Hyperlink"/>
@@ -1153,7 +1221,7 @@
               <w:rPr>
                 <w:noProof/>
               </w:rPr>
-              <w:instrText xml:space="preserve"> PAGEREF _Toc239079459 \h </w:instrText>
+              <w:instrText xml:space="preserve"> PAGEREF _Toc239080362 \h </w:instrText>
             </w:r>
             <w:r>
               <w:rPr>
@@ -1170,7 +1238,75 @@
               <w:rPr>
                 <w:noProof/>
               </w:rPr>
-              <w:t>7</w:t>
+              <w:t>8</w:t>
+            </w:r>
+            <w:r>
+              <w:rPr>
+                <w:noProof/>
+              </w:rPr>
+              <w:fldChar w:fldCharType="end"/>
+            </w:r>
+          </w:hyperlink>
+        </w:p>
+        <w:p>
+          <w:pPr>
+            <w:pStyle w:val="TOC2"/>
+            <w:tabs>
+              <w:tab w:val="right" w:leader="dot" w:pos="9016"/>
+            </w:tabs>
+            <w:rPr>
+              <w:rFonts w:asciiTheme="minorHAnsi" w:eastAsiaTheme="minorEastAsia" w:hAnsiTheme="minorHAnsi" w:cstheme="minorBidi"/>
+              <w:noProof/>
+              <w:kern w:val="2"/>
+              <w:sz w:val="24"/>
+              <w:szCs w:val="24"/>
+              <w14:ligatures w14:val="standardContextual"/>
+            </w:rPr>
+          </w:pPr>
+          <w:hyperlink w:anchor="_Toc239080363" w:history="1">
+            <w:r>
+              <w:rPr>
+                <w:rStyle w:val="Hyperlink"/>
+                <w:b/>
+                <w:bCs/>
+                <w:noProof/>
+              </w:rPr>
+              <w:t>Traditional vs. Pipeline</w:t>
+            </w:r>
+            <w:r>
+              <w:rPr>
+                <w:noProof/>
+              </w:rPr>
+              <w:tab/>
+            </w:r>
+            <w:r>
+              <w:rPr>
+                <w:noProof/>
+              </w:rPr>
+              <w:fldChar w:fldCharType="begin"/>
+            </w:r>
+            <w:r>
+              <w:rPr>
+                <w:noProof/>
+              </w:rPr>
+              <w:instrText xml:space="preserve"> PAGEREF _Toc239080363 \h </w:instrText>
+            </w:r>
+            <w:r>
+              <w:rPr>
+                <w:noProof/>
+              </w:rPr>
+            </w:r>
+            <w:r>
+              <w:rPr>
+                <w:noProof/>
+              </w:rPr>
+              <w:fldChar w:fldCharType="separate"/>
+            </w:r>
+            <w:r>
+              <w:rPr>
+                <w:noProof/>
+              </w:rPr>
+              <w:t>8</w:t>
             </w:r>
             <w:r>
               <w:rPr>
@@ -1197,7 +1333,7 @@
         <w:pStyle w:val="Heading1"/>
         <w:spacing w:before="400" w:after="200"/>
       </w:pPr>
-      <w:bookmarkStart w:id="1" w:name="_Toc239079445"/>
+      <w:bookmarkStart w:id="1" w:name="_Toc239080347"/>
       <w:r>
         <w:rPr>
           <w:b/>
@@ -1267,7 +1403,7 @@
         <w:pStyle w:val="Heading1"/>
         <w:spacing w:before="400" w:after="200"/>
       </w:pPr>
-      <w:bookmarkStart w:id="2" w:name="_Toc239079446"/>
+      <w:bookmarkStart w:id="2" w:name="_Toc239080348"/>
       <w:r>
         <w:rPr>
           <w:b/>
@@ -1307,14 +1443,14 @@
         <w:pStyle w:val="Heading2"/>
         <w:spacing w:before="300" w:after="150"/>
       </w:pPr>
-      <w:bookmarkStart w:id="3" w:name="_Toc239079447"/>
+      <w:bookmarkStart w:id="3" w:name="_Toc239080349"/>
       <w:r>
         <w:rPr>
           <w:b/>
           <w:bCs/>
           <w:color w:val="1F4E79"/>
         </w:rPr>
-        <w:t>Step 1: Engineer, Impute, Encode, Train</w:t>
+        <w:t>Step 1: Split, Then Engineer, Impute, Encode, Train</w:t>
       </w:r>
       <w:bookmarkEnd w:id="3"/>
     </w:p>
@@ -1332,7 +1468,7 @@
           <w:sz w:val="23"/>
           <w:szCs w:val="23"/>
         </w:rPr>
-        <w:t>Engineer a simple ratio feature: Amount_per_Month = Credit_Amount / Duration_in_Months.</w:t>
+        <w:t>Split into train and test first, before any preprocessing touches the data.</w:t>
       </w:r>
     </w:p>
     <w:p>
@@ -1349,7 +1485,7 @@
           <w:sz w:val="23"/>
           <w:szCs w:val="23"/>
         </w:rPr>
-        <w:t>Fill missing numeric values with the median, missing categorical values with the mode (most frequent value).</w:t>
+        <w:t>Engineer a simple ratio feature: Amount_per_Month = Credit_Amount / Duration_in_Months.</w:t>
       </w:r>
     </w:p>
     <w:p>
@@ -1366,7 +1502,7 @@
           <w:sz w:val="23"/>
           <w:szCs w:val="23"/>
         </w:rPr>
-        <w:t>One-hot encode the categorical columns with pd.get_dummies.</w:t>
+        <w:t>Fill missing numeric values with the median, missing categorical values with the mode (most frequent value), both computed from the training split only.</w:t>
       </w:r>
     </w:p>
     <w:p>
@@ -1383,7 +1519,36 @@
           <w:sz w:val="23"/>
           <w:szCs w:val="23"/>
         </w:rPr>
+        <w:t>One-hot encode the categorical columns with pd.get_dummies, then align the test columns to match.</w:t>
+      </w:r>
+    </w:p>
+    <w:p>
+      <w:pPr>
+        <w:pStyle w:val="ListParagraph"/>
+        <w:numPr>
+          <w:ilvl w:val="0"/>
+          <w:numId w:val="1"/>
+        </w:numPr>
+        <w:spacing w:after="100" w:line="300" w:lineRule="auto"/>
+      </w:pPr>
+      <w:r>
+        <w:rPr>
+          <w:sz w:val="23"/>
+          <w:szCs w:val="23"/>
+        </w:rPr>
         <w:t>Train an unrestricted Decision Tree on the result.</w:t>
+      </w:r>
+    </w:p>
+    <w:p>
+      <w:pPr>
+        <w:spacing w:after="160" w:line="300" w:lineRule="auto"/>
+      </w:pPr>
+      <w:r>
+        <w:rPr>
+          <w:sz w:val="23"/>
+          <w:szCs w:val="23"/>
+        </w:rPr>
+        <w:t>That first bullet matters more than it looks. A median or a mode is a statistic learned from data, exactly like a model's coefficients, so it has to be learned from the training rows only. An earlier draft of this case study imputed on the full dataset before splitting, which lets the fill values used on training rows be quietly informed by test rows too, a real leakage risk, not a hypothetical one. Splitting first, then computing the median/mode from the training split alone, closes that gap.</w:t>
       </w:r>
     </w:p>
     <w:p>
@@ -1391,7 +1556,7 @@
         <w:pStyle w:val="Heading2"/>
         <w:spacing w:before="300" w:after="150"/>
       </w:pPr>
-      <w:bookmarkStart w:id="4" w:name="_Toc239079448"/>
+      <w:bookmarkStart w:id="4" w:name="_Toc239080350"/>
       <w:r>
         <w:rPr>
           <w:b/>
@@ -1411,6 +1576,7 @@
           <w:sz w:val="23"/>
           <w:szCs w:val="23"/>
         </w:rPr>
+        <w:lastRenderedPageBreak/>
         <w:t>GridSearchCV searches over max_depth and min_samples_leaf, scored by recall, and grid_search.best_estimator_ is the model actually selected.</w:t>
       </w:r>
     </w:p>
@@ -1437,9 +1603,8 @@
         <w:rPr>
           <w:noProof/>
         </w:rPr>
-        <w:lastRenderedPageBreak/>
         <w:drawing>
-          <wp:inline distT="0" distB="0" distL="0" distR="0" wp14:anchorId="2983BCAB" wp14:editId="3DE9BCF8">
+          <wp:inline distT="0" distB="0" distL="0" distR="0" wp14:anchorId="1ADB550A" wp14:editId="6B5A2EA1">
             <wp:extent cx="5852160" cy="3566160"/>
             <wp:effectExtent l="0" t="0" r="0" b="0"/>
             <wp:docPr id="1" name="Picture 1"/>
@@ -1487,7 +1652,7 @@
           <w:sz w:val="23"/>
           <w:szCs w:val="23"/>
         </w:rPr>
-        <w:t>The unrestricted base tree reaches 100% train recall but only 81.9% test recall, a large gap, the classic sign of overfitting: the tree has memorised quirks of the training rows that don't hold up on new data. Tuning to max_depth=7, min_samples_leaf=5 gives up a little training recall (82.7%) in exchange for a smaller, more trustworthy gap, and even slightly better test recall (84.1%). That tuned tree is the one actually selected for deployment.</w:t>
+        <w:t>The unrestricted base tree reaches 100% train recall but only 81.7% test recall, a large gap, the classic sign of overfitting: the tree has memorised quirks of the training rows that don't hold up on new data. Tuning to max_depth=7, min_samples_leaf=5 gives up a little training recall (82.7%) in exchange for a smaller, more trustworthy gap, and even slightly better test recall (84.1%). That tuned tree is the one actually selected for deployment.</w:t>
       </w:r>
     </w:p>
     <w:p>
@@ -1495,7 +1660,7 @@
         <w:pStyle w:val="Heading1"/>
         <w:spacing w:before="400" w:after="200"/>
       </w:pPr>
-      <w:bookmarkStart w:id="5" w:name="_Toc239079449"/>
+      <w:bookmarkStart w:id="5" w:name="_Toc239080351"/>
       <w:r>
         <w:rPr>
           <w:b/>
@@ -1555,10 +1720,10 @@
         </w:rPr>
         <w:lastRenderedPageBreak/>
         <w:drawing>
-          <wp:inline distT="0" distB="0" distL="0" distR="0" wp14:anchorId="4B034F8F" wp14:editId="590FF624">
+          <wp:inline distT="0" distB="0" distL="0" distR="0" wp14:anchorId="7DBBDA0F" wp14:editId="2AA97028">
             <wp:extent cx="5943600" cy="1828800"/>
             <wp:effectExtent l="0" t="0" r="0" b="0"/>
-            <wp:docPr id="672348203" name="Picture 672348203"/>
+            <wp:docPr id="1430058631" name="Picture 1430058631"/>
             <wp:cNvGraphicFramePr>
               <a:graphicFrameLocks xmlns:a="http://schemas.openxmlformats.org/drawingml/2006/main" noChangeAspect="1"/>
             </wp:cNvGraphicFramePr>
@@ -1599,7 +1764,7 @@
         <w:pStyle w:val="Heading1"/>
         <w:spacing w:before="400" w:after="200"/>
       </w:pPr>
-      <w:bookmarkStart w:id="6" w:name="_Toc239079450"/>
+      <w:bookmarkStart w:id="6" w:name="_Toc239080352"/>
       <w:r>
         <w:rPr>
           <w:b/>
@@ -1962,7 +2127,7 @@
         <w:pStyle w:val="Heading1"/>
         <w:spacing w:before="400" w:after="200"/>
       </w:pPr>
-      <w:bookmarkStart w:id="7" w:name="_Toc239079451"/>
+      <w:bookmarkStart w:id="7" w:name="_Toc239080353"/>
       <w:r>
         <w:rPr>
           <w:b/>
@@ -2037,7 +2202,7 @@
         <w:pStyle w:val="Heading2"/>
         <w:spacing w:before="300" w:after="150"/>
       </w:pPr>
-      <w:bookmarkStart w:id="8" w:name="_Toc239079452"/>
+      <w:bookmarkStart w:id="8" w:name="_Toc239080354"/>
       <w:r>
         <w:rPr>
           <w:b/>
@@ -2072,7 +2237,7 @@
         <w:pStyle w:val="Heading1"/>
         <w:spacing w:before="400" w:after="200"/>
       </w:pPr>
-      <w:bookmarkStart w:id="9" w:name="_Toc239079453"/>
+      <w:bookmarkStart w:id="9" w:name="_Toc239080355"/>
       <w:r>
         <w:rPr>
           <w:b/>
@@ -2153,16 +2318,681 @@
         <w:pStyle w:val="Heading1"/>
         <w:spacing w:before="400" w:after="200"/>
       </w:pPr>
-      <w:bookmarkStart w:id="10" w:name="_Toc239079454"/>
+      <w:bookmarkStart w:id="10" w:name="_Toc239080356"/>
       <w:r>
         <w:rPr>
           <w:b/>
           <w:bCs/>
           <w:color w:val="8B4513"/>
         </w:rPr>
-        <w:t>7. Practical Guidance</w:t>
+        <w:t>7. Traditional Method vs. Pipeline: Side by Side</w:t>
       </w:r>
       <w:bookmarkEnd w:id="10"/>
+    </w:p>
+    <w:tbl>
+      <w:tblPr>
+        <w:tblW w:w="9000" w:type="dxa"/>
+        <w:tblBorders>
+          <w:top w:val="single" w:sz="4" w:space="0" w:color="auto"/>
+          <w:left w:val="single" w:sz="4" w:space="0" w:color="auto"/>
+          <w:bottom w:val="single" w:sz="4" w:space="0" w:color="auto"/>
+          <w:right w:val="single" w:sz="4" w:space="0" w:color="auto"/>
+          <w:insideH w:val="single" w:sz="4" w:space="0" w:color="auto"/>
+          <w:insideV w:val="single" w:sz="4" w:space="0" w:color="auto"/>
+        </w:tblBorders>
+        <w:tblCellMar>
+          <w:left w:w="10" w:type="dxa"/>
+          <w:right w:w="10" w:type="dxa"/>
+        </w:tblCellMar>
+        <w:tblLook w:val="04A0" w:firstRow="1" w:lastRow="0" w:firstColumn="1" w:lastColumn="0" w:noHBand="0" w:noVBand="1"/>
+      </w:tblPr>
+      <w:tblGrid>
+        <w:gridCol w:w="2600"/>
+        <w:gridCol w:w="3300"/>
+        <w:gridCol w:w="3100"/>
+      </w:tblGrid>
+      <w:tr>
+        <w:tblPrEx>
+          <w:tblCellMar>
+            <w:top w:w="0" w:type="dxa"/>
+            <w:bottom w:w="0" w:type="dxa"/>
+          </w:tblCellMar>
+        </w:tblPrEx>
+        <w:trPr>
+          <w:tblHeader/>
+        </w:trPr>
+        <w:tc>
+          <w:tcPr>
+            <w:tcW w:w="2600" w:type="dxa"/>
+            <w:shd w:val="clear" w:color="auto" w:fill="8B4513"/>
+            <w:tcMar>
+              <w:top w:w="80" w:type="dxa"/>
+              <w:left w:w="100" w:type="dxa"/>
+              <w:bottom w:w="80" w:type="dxa"/>
+              <w:right w:w="100" w:type="dxa"/>
+            </w:tcMar>
+            <w:vAlign w:val="center"/>
+          </w:tcPr>
+          <w:p>
+            <w:pPr>
+              <w:jc w:val="center"/>
+            </w:pPr>
+            <w:r>
+              <w:rPr>
+                <w:b/>
+                <w:bCs/>
+                <w:color w:val="FFFFFF"/>
+                <w:sz w:val="21"/>
+                <w:szCs w:val="21"/>
+              </w:rPr>
+              <w:t>Aspect</w:t>
+            </w:r>
+          </w:p>
+        </w:tc>
+        <w:tc>
+          <w:tcPr>
+            <w:tcW w:w="3300" w:type="dxa"/>
+            <w:shd w:val="clear" w:color="auto" w:fill="8B4513"/>
+            <w:tcMar>
+              <w:top w:w="80" w:type="dxa"/>
+              <w:left w:w="100" w:type="dxa"/>
+              <w:bottom w:w="80" w:type="dxa"/>
+              <w:right w:w="100" w:type="dxa"/>
+            </w:tcMar>
+            <w:vAlign w:val="center"/>
+          </w:tcPr>
+          <w:p>
+            <w:pPr>
+              <w:jc w:val="center"/>
+            </w:pPr>
+            <w:r>
+              <w:rPr>
+                <w:b/>
+                <w:bCs/>
+                <w:color w:val="FFFFFF"/>
+                <w:sz w:val="21"/>
+                <w:szCs w:val="21"/>
+              </w:rPr>
+              <w:t>Traditional (Manual)</w:t>
+            </w:r>
+          </w:p>
+        </w:tc>
+        <w:tc>
+          <w:tcPr>
+            <w:tcW w:w="3100" w:type="dxa"/>
+            <w:shd w:val="clear" w:color="auto" w:fill="8B4513"/>
+            <w:tcMar>
+              <w:top w:w="80" w:type="dxa"/>
+              <w:left w:w="100" w:type="dxa"/>
+              <w:bottom w:w="80" w:type="dxa"/>
+              <w:right w:w="100" w:type="dxa"/>
+            </w:tcMar>
+            <w:vAlign w:val="center"/>
+          </w:tcPr>
+          <w:p>
+            <w:pPr>
+              <w:jc w:val="center"/>
+            </w:pPr>
+            <w:r>
+              <w:rPr>
+                <w:b/>
+                <w:bCs/>
+                <w:color w:val="FFFFFF"/>
+                <w:sz w:val="21"/>
+                <w:szCs w:val="21"/>
+              </w:rPr>
+              <w:t>Pipeline</w:t>
+            </w:r>
+          </w:p>
+        </w:tc>
+      </w:tr>
+      <w:tr>
+        <w:tblPrEx>
+          <w:tblCellMar>
+            <w:top w:w="0" w:type="dxa"/>
+            <w:bottom w:w="0" w:type="dxa"/>
+          </w:tblCellMar>
+        </w:tblPrEx>
+        <w:tc>
+          <w:tcPr>
+            <w:tcW w:w="2600" w:type="dxa"/>
+            <w:shd w:val="clear" w:color="auto" w:fill="FFFFFF"/>
+            <w:tcMar>
+              <w:top w:w="80" w:type="dxa"/>
+              <w:left w:w="100" w:type="dxa"/>
+              <w:bottom w:w="80" w:type="dxa"/>
+              <w:right w:w="100" w:type="dxa"/>
+            </w:tcMar>
+            <w:vAlign w:val="center"/>
+          </w:tcPr>
+          <w:p>
+            <w:pPr>
+              <w:jc w:val="center"/>
+            </w:pPr>
+            <w:r>
+              <w:rPr>
+                <w:sz w:val="21"/>
+                <w:szCs w:val="21"/>
+              </w:rPr>
+              <w:t>Code structure</w:t>
+            </w:r>
+          </w:p>
+        </w:tc>
+        <w:tc>
+          <w:tcPr>
+            <w:tcW w:w="3300" w:type="dxa"/>
+            <w:shd w:val="clear" w:color="auto" w:fill="FFFFFF"/>
+            <w:tcMar>
+              <w:top w:w="80" w:type="dxa"/>
+              <w:left w:w="100" w:type="dxa"/>
+              <w:bottom w:w="80" w:type="dxa"/>
+              <w:right w:w="100" w:type="dxa"/>
+            </w:tcMar>
+            <w:vAlign w:val="center"/>
+          </w:tcPr>
+          <w:p>
+            <w:pPr>
+              <w:jc w:val="center"/>
+            </w:pPr>
+            <w:r>
+              <w:rPr>
+                <w:sz w:val="21"/>
+                <w:szCs w:val="21"/>
+              </w:rPr>
+              <w:t>Several separate steps, each reassigning a dataframe by hand</w:t>
+            </w:r>
+          </w:p>
+        </w:tc>
+        <w:tc>
+          <w:tcPr>
+            <w:tcW w:w="3100" w:type="dxa"/>
+            <w:shd w:val="clear" w:color="auto" w:fill="FFFFFF"/>
+            <w:tcMar>
+              <w:top w:w="80" w:type="dxa"/>
+              <w:left w:w="100" w:type="dxa"/>
+              <w:bottom w:w="80" w:type="dxa"/>
+              <w:right w:w="100" w:type="dxa"/>
+            </w:tcMar>
+            <w:vAlign w:val="center"/>
+          </w:tcPr>
+          <w:p>
+            <w:pPr>
+              <w:jc w:val="center"/>
+            </w:pPr>
+            <w:r>
+              <w:rPr>
+                <w:sz w:val="21"/>
+                <w:szCs w:val="21"/>
+              </w:rPr>
+              <w:t>One object; one fit(), one predict()</w:t>
+            </w:r>
+          </w:p>
+        </w:tc>
+      </w:tr>
+      <w:tr>
+        <w:tblPrEx>
+          <w:tblCellMar>
+            <w:top w:w="0" w:type="dxa"/>
+            <w:bottom w:w="0" w:type="dxa"/>
+          </w:tblCellMar>
+        </w:tblPrEx>
+        <w:tc>
+          <w:tcPr>
+            <w:tcW w:w="2600" w:type="dxa"/>
+            <w:shd w:val="clear" w:color="auto" w:fill="FFFFFF"/>
+            <w:tcMar>
+              <w:top w:w="80" w:type="dxa"/>
+              <w:left w:w="100" w:type="dxa"/>
+              <w:bottom w:w="80" w:type="dxa"/>
+              <w:right w:w="100" w:type="dxa"/>
+            </w:tcMar>
+            <w:vAlign w:val="center"/>
+          </w:tcPr>
+          <w:p>
+            <w:pPr>
+              <w:jc w:val="center"/>
+            </w:pPr>
+            <w:r>
+              <w:rPr>
+                <w:sz w:val="21"/>
+                <w:szCs w:val="21"/>
+              </w:rPr>
+              <w:t>Repeating preprocessing on new data</w:t>
+            </w:r>
+          </w:p>
+        </w:tc>
+        <w:tc>
+          <w:tcPr>
+            <w:tcW w:w="3300" w:type="dxa"/>
+            <w:shd w:val="clear" w:color="auto" w:fill="FFFFFF"/>
+            <w:tcMar>
+              <w:top w:w="80" w:type="dxa"/>
+              <w:left w:w="100" w:type="dxa"/>
+              <w:bottom w:w="80" w:type="dxa"/>
+              <w:right w:w="100" w:type="dxa"/>
+            </w:tcMar>
+            <w:vAlign w:val="center"/>
+          </w:tcPr>
+          <w:p>
+            <w:pPr>
+              <w:jc w:val="center"/>
+            </w:pPr>
+            <w:r>
+              <w:rPr>
+                <w:sz w:val="21"/>
+                <w:szCs w:val="21"/>
+              </w:rPr>
+              <w:t>Has to be redone by hand, in the exact same order, every time</w:t>
+            </w:r>
+          </w:p>
+        </w:tc>
+        <w:tc>
+          <w:tcPr>
+            <w:tcW w:w="3100" w:type="dxa"/>
+            <w:shd w:val="clear" w:color="auto" w:fill="FFFFFF"/>
+            <w:tcMar>
+              <w:top w:w="80" w:type="dxa"/>
+              <w:left w:w="100" w:type="dxa"/>
+              <w:bottom w:w="80" w:type="dxa"/>
+              <w:right w:w="100" w:type="dxa"/>
+            </w:tcMar>
+            <w:vAlign w:val="center"/>
+          </w:tcPr>
+          <w:p>
+            <w:pPr>
+              <w:jc w:val="center"/>
+            </w:pPr>
+            <w:r>
+              <w:rPr>
+                <w:sz w:val="21"/>
+                <w:szCs w:val="21"/>
+              </w:rPr>
+              <w:t>Runs automatically, in order, whenever fit()/predict() is called</w:t>
+            </w:r>
+          </w:p>
+        </w:tc>
+      </w:tr>
+      <w:tr>
+        <w:tblPrEx>
+          <w:tblCellMar>
+            <w:top w:w="0" w:type="dxa"/>
+            <w:bottom w:w="0" w:type="dxa"/>
+          </w:tblCellMar>
+        </w:tblPrEx>
+        <w:tc>
+          <w:tcPr>
+            <w:tcW w:w="2600" w:type="dxa"/>
+            <w:shd w:val="clear" w:color="auto" w:fill="FFFFFF"/>
+            <w:tcMar>
+              <w:top w:w="80" w:type="dxa"/>
+              <w:left w:w="100" w:type="dxa"/>
+              <w:bottom w:w="80" w:type="dxa"/>
+              <w:right w:w="100" w:type="dxa"/>
+            </w:tcMar>
+            <w:vAlign w:val="center"/>
+          </w:tcPr>
+          <w:p>
+            <w:pPr>
+              <w:jc w:val="center"/>
+            </w:pPr>
+            <w:r>
+              <w:rPr>
+                <w:sz w:val="21"/>
+                <w:szCs w:val="21"/>
+              </w:rPr>
+              <w:t>Leakage risk</w:t>
+            </w:r>
+          </w:p>
+        </w:tc>
+        <w:tc>
+          <w:tcPr>
+            <w:tcW w:w="3300" w:type="dxa"/>
+            <w:shd w:val="clear" w:color="auto" w:fill="FFFFFF"/>
+            <w:tcMar>
+              <w:top w:w="80" w:type="dxa"/>
+              <w:left w:w="100" w:type="dxa"/>
+              <w:bottom w:w="80" w:type="dxa"/>
+              <w:right w:w="100" w:type="dxa"/>
+            </w:tcMar>
+            <w:vAlign w:val="center"/>
+          </w:tcPr>
+          <w:p>
+            <w:pPr>
+              <w:jc w:val="center"/>
+            </w:pPr>
+            <w:r>
+              <w:rPr>
+                <w:sz w:val="21"/>
+                <w:szCs w:val="21"/>
+              </w:rPr>
+              <w:t xml:space="preserve">Real, and easy to get wrong, imputing before splitting (as an earlier draft here actually did) </w:t>
+            </w:r>
+            <w:r>
+              <w:rPr>
+                <w:sz w:val="21"/>
+                <w:szCs w:val="21"/>
+              </w:rPr>
+              <w:lastRenderedPageBreak/>
+              <w:t>silently lets test rows influence training-time fill values</w:t>
+            </w:r>
+          </w:p>
+        </w:tc>
+        <w:tc>
+          <w:tcPr>
+            <w:tcW w:w="3100" w:type="dxa"/>
+            <w:shd w:val="clear" w:color="auto" w:fill="FFFFFF"/>
+            <w:tcMar>
+              <w:top w:w="80" w:type="dxa"/>
+              <w:left w:w="100" w:type="dxa"/>
+              <w:bottom w:w="80" w:type="dxa"/>
+              <w:right w:w="100" w:type="dxa"/>
+            </w:tcMar>
+            <w:vAlign w:val="center"/>
+          </w:tcPr>
+          <w:p>
+            <w:pPr>
+              <w:jc w:val="center"/>
+            </w:pPr>
+            <w:r>
+              <w:rPr>
+                <w:sz w:val="21"/>
+                <w:szCs w:val="21"/>
+              </w:rPr>
+              <w:lastRenderedPageBreak/>
+              <w:t>Structurally harder to leak: a step only ever sees whatever is passed to fit()</w:t>
+            </w:r>
+          </w:p>
+        </w:tc>
+      </w:tr>
+      <w:tr>
+        <w:tblPrEx>
+          <w:tblCellMar>
+            <w:top w:w="0" w:type="dxa"/>
+            <w:bottom w:w="0" w:type="dxa"/>
+          </w:tblCellMar>
+        </w:tblPrEx>
+        <w:tc>
+          <w:tcPr>
+            <w:tcW w:w="2600" w:type="dxa"/>
+            <w:shd w:val="clear" w:color="auto" w:fill="FFFFFF"/>
+            <w:tcMar>
+              <w:top w:w="80" w:type="dxa"/>
+              <w:left w:w="100" w:type="dxa"/>
+              <w:bottom w:w="80" w:type="dxa"/>
+              <w:right w:w="100" w:type="dxa"/>
+            </w:tcMar>
+            <w:vAlign w:val="center"/>
+          </w:tcPr>
+          <w:p>
+            <w:pPr>
+              <w:jc w:val="center"/>
+            </w:pPr>
+            <w:r>
+              <w:rPr>
+                <w:sz w:val="21"/>
+                <w:szCs w:val="21"/>
+              </w:rPr>
+              <w:t>Deploying/reusing the model</w:t>
+            </w:r>
+          </w:p>
+        </w:tc>
+        <w:tc>
+          <w:tcPr>
+            <w:tcW w:w="3300" w:type="dxa"/>
+            <w:shd w:val="clear" w:color="auto" w:fill="FFFFFF"/>
+            <w:tcMar>
+              <w:top w:w="80" w:type="dxa"/>
+              <w:left w:w="100" w:type="dxa"/>
+              <w:bottom w:w="80" w:type="dxa"/>
+              <w:right w:w="100" w:type="dxa"/>
+            </w:tcMar>
+            <w:vAlign w:val="center"/>
+          </w:tcPr>
+          <w:p>
+            <w:pPr>
+              <w:jc w:val="center"/>
+            </w:pPr>
+            <w:r>
+              <w:rPr>
+                <w:sz w:val="21"/>
+                <w:szCs w:val="21"/>
+              </w:rPr>
+              <w:t>Model and preprocessing logic live separately; easy for them to drift out of sync over time</w:t>
+            </w:r>
+          </w:p>
+        </w:tc>
+        <w:tc>
+          <w:tcPr>
+            <w:tcW w:w="3100" w:type="dxa"/>
+            <w:shd w:val="clear" w:color="auto" w:fill="FFFFFF"/>
+            <w:tcMar>
+              <w:top w:w="80" w:type="dxa"/>
+              <w:left w:w="100" w:type="dxa"/>
+              <w:bottom w:w="80" w:type="dxa"/>
+              <w:right w:w="100" w:type="dxa"/>
+            </w:tcMar>
+            <w:vAlign w:val="center"/>
+          </w:tcPr>
+          <w:p>
+            <w:pPr>
+              <w:jc w:val="center"/>
+            </w:pPr>
+            <w:r>
+              <w:rPr>
+                <w:sz w:val="21"/>
+                <w:szCs w:val="21"/>
+              </w:rPr>
+              <w:t>Model and preprocessing are one saved/loaded object, they can't drift apart</w:t>
+            </w:r>
+          </w:p>
+        </w:tc>
+      </w:tr>
+      <w:tr>
+        <w:tblPrEx>
+          <w:tblCellMar>
+            <w:top w:w="0" w:type="dxa"/>
+            <w:bottom w:w="0" w:type="dxa"/>
+          </w:tblCellMar>
+        </w:tblPrEx>
+        <w:tc>
+          <w:tcPr>
+            <w:tcW w:w="2600" w:type="dxa"/>
+            <w:shd w:val="clear" w:color="auto" w:fill="FFFFFF"/>
+            <w:tcMar>
+              <w:top w:w="80" w:type="dxa"/>
+              <w:left w:w="100" w:type="dxa"/>
+              <w:bottom w:w="80" w:type="dxa"/>
+              <w:right w:w="100" w:type="dxa"/>
+            </w:tcMar>
+            <w:vAlign w:val="center"/>
+          </w:tcPr>
+          <w:p>
+            <w:pPr>
+              <w:jc w:val="center"/>
+            </w:pPr>
+            <w:r>
+              <w:rPr>
+                <w:sz w:val="21"/>
+                <w:szCs w:val="21"/>
+              </w:rPr>
+              <w:t>Hyperparameter tuning</w:t>
+            </w:r>
+          </w:p>
+        </w:tc>
+        <w:tc>
+          <w:tcPr>
+            <w:tcW w:w="3300" w:type="dxa"/>
+            <w:shd w:val="clear" w:color="auto" w:fill="FFFFFF"/>
+            <w:tcMar>
+              <w:top w:w="80" w:type="dxa"/>
+              <w:left w:w="100" w:type="dxa"/>
+              <w:bottom w:w="80" w:type="dxa"/>
+              <w:right w:w="100" w:type="dxa"/>
+            </w:tcMar>
+            <w:vAlign w:val="center"/>
+          </w:tcPr>
+          <w:p>
+            <w:pPr>
+              <w:jc w:val="center"/>
+            </w:pPr>
+            <w:r>
+              <w:rPr>
+                <w:sz w:val="21"/>
+                <w:szCs w:val="21"/>
+              </w:rPr>
+              <w:t>Tunes the model only, unless preprocessing choices are tuned separately by hand</w:t>
+            </w:r>
+          </w:p>
+        </w:tc>
+        <w:tc>
+          <w:tcPr>
+            <w:tcW w:w="3100" w:type="dxa"/>
+            <w:shd w:val="clear" w:color="auto" w:fill="FFFFFF"/>
+            <w:tcMar>
+              <w:top w:w="80" w:type="dxa"/>
+              <w:left w:w="100" w:type="dxa"/>
+              <w:bottom w:w="80" w:type="dxa"/>
+              <w:right w:w="100" w:type="dxa"/>
+            </w:tcMar>
+            <w:vAlign w:val="center"/>
+          </w:tcPr>
+          <w:p>
+            <w:pPr>
+              <w:jc w:val="center"/>
+            </w:pPr>
+            <w:r>
+              <w:rPr>
+                <w:sz w:val="21"/>
+                <w:szCs w:val="21"/>
+              </w:rPr>
+              <w:t>GridSearchCV can tune preprocessing and model choices together, via step__param</w:t>
+            </w:r>
+          </w:p>
+        </w:tc>
+      </w:tr>
+      <w:tr>
+        <w:tblPrEx>
+          <w:tblCellMar>
+            <w:top w:w="0" w:type="dxa"/>
+            <w:bottom w:w="0" w:type="dxa"/>
+          </w:tblCellMar>
+        </w:tblPrEx>
+        <w:tc>
+          <w:tcPr>
+            <w:tcW w:w="2600" w:type="dxa"/>
+            <w:shd w:val="clear" w:color="auto" w:fill="FFFFFF"/>
+            <w:tcMar>
+              <w:top w:w="80" w:type="dxa"/>
+              <w:left w:w="100" w:type="dxa"/>
+              <w:bottom w:w="80" w:type="dxa"/>
+              <w:right w:w="100" w:type="dxa"/>
+            </w:tcMar>
+            <w:vAlign w:val="center"/>
+          </w:tcPr>
+          <w:p>
+            <w:pPr>
+              <w:jc w:val="center"/>
+            </w:pPr>
+            <w:r>
+              <w:rPr>
+                <w:sz w:val="21"/>
+                <w:szCs w:val="21"/>
+              </w:rPr>
+              <w:t>Visibility while debugging</w:t>
+            </w:r>
+          </w:p>
+        </w:tc>
+        <w:tc>
+          <w:tcPr>
+            <w:tcW w:w="3300" w:type="dxa"/>
+            <w:shd w:val="clear" w:color="auto" w:fill="FFFFFF"/>
+            <w:tcMar>
+              <w:top w:w="80" w:type="dxa"/>
+              <w:left w:w="100" w:type="dxa"/>
+              <w:bottom w:w="80" w:type="dxa"/>
+              <w:right w:w="100" w:type="dxa"/>
+            </w:tcMar>
+            <w:vAlign w:val="center"/>
+          </w:tcPr>
+          <w:p>
+            <w:pPr>
+              <w:jc w:val="center"/>
+            </w:pPr>
+            <w:r>
+              <w:rPr>
+                <w:sz w:val="21"/>
+                <w:szCs w:val="21"/>
+              </w:rPr>
+              <w:t>Every intermediate dataframe (imputed, encoded, ...) is sitting there to inspect</w:t>
+            </w:r>
+          </w:p>
+        </w:tc>
+        <w:tc>
+          <w:tcPr>
+            <w:tcW w:w="3100" w:type="dxa"/>
+            <w:shd w:val="clear" w:color="auto" w:fill="FFFFFF"/>
+            <w:tcMar>
+              <w:top w:w="80" w:type="dxa"/>
+              <w:left w:w="100" w:type="dxa"/>
+              <w:bottom w:w="80" w:type="dxa"/>
+              <w:right w:w="100" w:type="dxa"/>
+            </w:tcMar>
+            <w:vAlign w:val="center"/>
+          </w:tcPr>
+          <w:p>
+            <w:pPr>
+              <w:jc w:val="center"/>
+            </w:pPr>
+            <w:r>
+              <w:rPr>
+                <w:sz w:val="21"/>
+                <w:szCs w:val="21"/>
+              </w:rPr>
+              <w:t>Intermediate outputs are hidden inside the pipeline unless a step is inspected directly</w:t>
+            </w:r>
+          </w:p>
+        </w:tc>
+      </w:tr>
+    </w:tbl>
+    <w:p>
+      <w:pPr>
+        <w:spacing w:before="200"/>
+      </w:pPr>
+    </w:p>
+    <w:p>
+      <w:pPr>
+        <w:spacing w:after="160" w:line="300" w:lineRule="auto"/>
+      </w:pPr>
+      <w:r>
+        <w:rPr>
+          <w:sz w:val="23"/>
+          <w:szCs w:val="23"/>
+        </w:rPr>
+        <w:t>That last row is a genuine trade-off, not just an advantage for pipelines. While building this case study, seeing the imputed and encoded dataframes as separate, inspectable objects is exactly what made it possible to notice, and fix, the leakage bug described in Section 2, a mistake that would have been easier to miss inside a pipeline's hidden intermediate steps. Pipelines remove a category of mistakes at the cost of some of that step-by-step visibility: prototype and debug with the traditional approach f</w:t>
+      </w:r>
+      <w:r>
+        <w:rPr>
+          <w:sz w:val="23"/>
+          <w:szCs w:val="23"/>
+        </w:rPr>
+        <w:t>irst, then package into a pipeline once the logic is verified correct.</w:t>
+      </w:r>
+    </w:p>
+    <w:p>
+      <w:pPr>
+        <w:pStyle w:val="Heading1"/>
+        <w:spacing w:before="400" w:after="200"/>
+      </w:pPr>
+      <w:bookmarkStart w:id="11" w:name="_Toc239080357"/>
+      <w:r>
+        <w:rPr>
+          <w:b/>
+          <w:bCs/>
+          <w:color w:val="8B4513"/>
+        </w:rPr>
+        <w:t>8. Practical Guidance</w:t>
+      </w:r>
+      <w:bookmarkEnd w:id="11"/>
     </w:p>
     <w:p>
       <w:pPr>
@@ -2178,7 +3008,7 @@
           <w:sz w:val="23"/>
           <w:szCs w:val="23"/>
         </w:rPr>
-        <w:t>Build and tune a model the normal way first. Understand what it needs before packaging it, packaging is not a substitute for the modeling decision.</w:t>
+        <w:t>Always split before fitting anything that learns from data, including a simple imputer's median or mode, not just the model itself.</w:t>
       </w:r>
     </w:p>
     <w:p>
@@ -2195,7 +3025,7 @@
           <w:sz w:val="23"/>
           <w:szCs w:val="23"/>
         </w:rPr>
-        <w:t>Use FunctionTransformer for simple, stateless feature engineering; reach for a custom class only when a step needs to learn something from training data that a built-in transformer doesn't already provide.</w:t>
+        <w:t>Build and tune a model the normal way first. Understand what it needs before packaging it, packaging is not a substitute for the modeling decision.</w:t>
       </w:r>
     </w:p>
     <w:p>
@@ -2212,7 +3042,7 @@
           <w:sz w:val="23"/>
           <w:szCs w:val="23"/>
         </w:rPr>
-        <w:t>Keep the order of operations identical between any manual prototype and the final pipeline, then prove it with matching numbers, don't assume it.</w:t>
+        <w:t>Use FunctionTransformer for simple, stateless feature engineering; reach for a custom class only when a step needs to learn something from training data that a built-in transformer doesn't already provide.</w:t>
       </w:r>
     </w:p>
     <w:p>
@@ -2229,8 +3059,7 @@
           <w:sz w:val="23"/>
           <w:szCs w:val="23"/>
         </w:rPr>
-        <w:lastRenderedPageBreak/>
-        <w:t>Route different column types to different preprocessing using ColumnTransformer, one sub-pipeline per column group.</w:t>
+        <w:t>Keep the order of operations identical between any manual prototype and the final pipeline, then prove it with matching numbers, don't assume it.</w:t>
       </w:r>
     </w:p>
     <w:p>
@@ -2247,40 +3076,8 @@
           <w:sz w:val="23"/>
           <w:szCs w:val="23"/>
         </w:rPr>
-        <w:t>Prefer tuning the whole pipeline with GridSearchCV over tuning the model alone, especially once any step in the pipeline learns something from training data.</w:t>
-      </w:r>
-    </w:p>
-    <w:p>
-      <w:pPr>
-        <w:pStyle w:val="Heading1"/>
-        <w:spacing w:before="400" w:after="200"/>
-      </w:pPr>
-      <w:bookmarkStart w:id="11" w:name="_Toc239079455"/>
-      <w:r>
-        <w:rPr>
-          <w:b/>
-          <w:bCs/>
-          <w:color w:val="8B4513"/>
-        </w:rPr>
-        <w:t>Summary Cheat Sheet</w:t>
-      </w:r>
-      <w:bookmarkEnd w:id="11"/>
-    </w:p>
-    <w:p>
-      <w:pPr>
-        <w:pStyle w:val="Heading2"/>
-        <w:spacing w:before="300" w:after="150"/>
-      </w:pPr>
-      <w:bookmarkStart w:id="12" w:name="_Toc239079456"/>
-      <w:r>
-        <w:rPr>
-          <w:b/>
-          <w:bCs/>
-          <w:color w:val="1F4E79"/>
-        </w:rPr>
-        <w:t>What a Pipeline Is</w:t>
-      </w:r>
-      <w:bookmarkEnd w:id="12"/>
+        <w:t>Route different column types to different preprocessing using ColumnTransformer, one sub-pipeline per column group.</w:t>
+      </w:r>
     </w:p>
     <w:p>
       <w:pPr>
@@ -2296,8 +3093,40 @@
           <w:sz w:val="23"/>
           <w:szCs w:val="23"/>
         </w:rPr>
-        <w:t>A single object chaining transformers (steps with fit/transform) and a final model (fit/predict).</w:t>
-      </w:r>
+        <w:t>Prefer tuning the whole pipeline with GridSearchCV over tuning the model alone, especially once any step in the pipeline learns something from training data.</w:t>
+      </w:r>
+    </w:p>
+    <w:p>
+      <w:pPr>
+        <w:pStyle w:val="Heading1"/>
+        <w:spacing w:before="400" w:after="200"/>
+      </w:pPr>
+      <w:bookmarkStart w:id="12" w:name="_Toc239080358"/>
+      <w:r>
+        <w:rPr>
+          <w:b/>
+          <w:bCs/>
+          <w:color w:val="8B4513"/>
+        </w:rPr>
+        <w:t>Summary Cheat Sheet</w:t>
+      </w:r>
+      <w:bookmarkEnd w:id="12"/>
+    </w:p>
+    <w:p>
+      <w:pPr>
+        <w:pStyle w:val="Heading2"/>
+        <w:spacing w:before="300" w:after="150"/>
+      </w:pPr>
+      <w:bookmarkStart w:id="13" w:name="_Toc239080359"/>
+      <w:r>
+        <w:rPr>
+          <w:b/>
+          <w:bCs/>
+          <w:color w:val="1F4E79"/>
+        </w:rPr>
+        <w:t>What a Pipeline Is</w:t>
+      </w:r>
+      <w:bookmarkEnd w:id="13"/>
     </w:p>
     <w:p>
       <w:pPr>
@@ -2313,24 +3142,9 @@
           <w:sz w:val="23"/>
           <w:szCs w:val="23"/>
         </w:rPr>
-        <w:t>make_pipeline(...) auto-names each step from its class name, lowercased.</w:t>
-      </w:r>
-    </w:p>
-    <w:p>
-      <w:pPr>
-        <w:pStyle w:val="Heading2"/>
-        <w:spacing w:before="300" w:after="150"/>
-      </w:pPr>
-      <w:bookmarkStart w:id="13" w:name="_Toc239079457"/>
-      <w:r>
-        <w:rPr>
-          <w:b/>
-          <w:bCs/>
-          <w:color w:val="1F4E79"/>
-        </w:rPr>
-        <w:t>Building Blocks Used Here</w:t>
-      </w:r>
-      <w:bookmarkEnd w:id="13"/>
+        <w:lastRenderedPageBreak/>
+        <w:t>A single object chaining transformers (steps with fit/transform) and a final model (fit/predict).</w:t>
+      </w:r>
     </w:p>
     <w:p>
       <w:pPr>
@@ -2346,8 +3160,24 @@
           <w:sz w:val="23"/>
           <w:szCs w:val="23"/>
         </w:rPr>
-        <w:t>FunctionTransformer(your_function) — wraps a plain function as a pipeline step, no class needed.</w:t>
-      </w:r>
+        <w:t>make_pipeline(...) auto-names each step from its class name, lowercased.</w:t>
+      </w:r>
+    </w:p>
+    <w:p>
+      <w:pPr>
+        <w:pStyle w:val="Heading2"/>
+        <w:spacing w:before="300" w:after="150"/>
+      </w:pPr>
+      <w:bookmarkStart w:id="14" w:name="_Toc239080360"/>
+      <w:r>
+        <w:rPr>
+          <w:b/>
+          <w:bCs/>
+          <w:color w:val="1F4E79"/>
+        </w:rPr>
+        <w:t>Building Blocks Used Here</w:t>
+      </w:r>
+      <w:bookmarkEnd w:id="14"/>
     </w:p>
     <w:p>
       <w:pPr>
@@ -2363,7 +3193,7 @@
           <w:sz w:val="23"/>
           <w:szCs w:val="23"/>
         </w:rPr>
-        <w:t>SimpleImputer(strategy=...) — fills missing values ("median", "most_frequent", etc.).</w:t>
+        <w:t>FunctionTransformer(your_function) — wraps a plain function as a pipeline step, no class needed.</w:t>
       </w:r>
     </w:p>
     <w:p>
@@ -2380,7 +3210,7 @@
           <w:sz w:val="23"/>
           <w:szCs w:val="23"/>
         </w:rPr>
-        <w:t>OneHotEncoder(drop="first") — turns categorical columns into 0/1 columns.</w:t>
+        <w:t>SimpleImputer(strategy=...) — fills missing values ("median", "most_frequent", etc.).</w:t>
       </w:r>
     </w:p>
     <w:p>
@@ -2397,24 +3227,8 @@
           <w:sz w:val="23"/>
           <w:szCs w:val="23"/>
         </w:rPr>
-        <w:t>ColumnTransformer([...]) — routes different columns to different preprocessing.</w:t>
-      </w:r>
-    </w:p>
-    <w:p>
-      <w:pPr>
-        <w:pStyle w:val="Heading2"/>
-        <w:spacing w:before="300" w:after="150"/>
-      </w:pPr>
-      <w:bookmarkStart w:id="14" w:name="_Toc239079458"/>
-      <w:r>
-        <w:rPr>
-          <w:b/>
-          <w:bCs/>
-          <w:color w:val="1F4E79"/>
-        </w:rPr>
-        <w:t>Tuning</w:t>
-      </w:r>
-      <w:bookmarkEnd w:id="14"/>
+        <w:t>OneHotEncoder(drop="first") — turns categorical columns into 0/1 columns.</w:t>
+      </w:r>
     </w:p>
     <w:p>
       <w:pPr>
@@ -2430,8 +3244,24 @@
           <w:sz w:val="23"/>
           <w:szCs w:val="23"/>
         </w:rPr>
-        <w:t>Address a pipeline step's parameter as stepname__parameter in a GridSearchCV param_grid.</w:t>
-      </w:r>
+        <w:t>ColumnTransformer([...]) — routes different columns to different preprocessing.</w:t>
+      </w:r>
+    </w:p>
+    <w:p>
+      <w:pPr>
+        <w:pStyle w:val="Heading2"/>
+        <w:spacing w:before="300" w:after="150"/>
+      </w:pPr>
+      <w:bookmarkStart w:id="15" w:name="_Toc239080361"/>
+      <w:r>
+        <w:rPr>
+          <w:b/>
+          <w:bCs/>
+          <w:color w:val="1F4E79"/>
+        </w:rPr>
+        <w:t>Tuning</w:t>
+      </w:r>
+      <w:bookmarkEnd w:id="15"/>
     </w:p>
     <w:p>
       <w:pPr>
@@ -2447,24 +3277,8 @@
           <w:sz w:val="23"/>
           <w:szCs w:val="23"/>
         </w:rPr>
-        <w:t>Tuning the whole pipeline (not just the model) keeps every fold's preprocessing fit fresh.</w:t>
-      </w:r>
-    </w:p>
-    <w:p>
-      <w:pPr>
-        <w:pStyle w:val="Heading2"/>
-        <w:spacing w:before="300" w:after="150"/>
-      </w:pPr>
-      <w:bookmarkStart w:id="15" w:name="_Toc239079459"/>
-      <w:r>
-        <w:rPr>
-          <w:b/>
-          <w:bCs/>
-          <w:color w:val="1F4E79"/>
-        </w:rPr>
-        <w:t>The One Thing to Verify</w:t>
-      </w:r>
-      <w:bookmarkEnd w:id="15"/>
+        <w:t>Address a pipeline step's parameter as stepname__parameter in a GridSearchCV param_grid.</w:t>
+      </w:r>
     </w:p>
     <w:p>
       <w:pPr>
@@ -2480,7 +3294,90 @@
           <w:sz w:val="23"/>
           <w:szCs w:val="23"/>
         </w:rPr>
+        <w:t>Tuning the whole pipeline (not just the model) keeps every fold's preprocessing fit fresh.</w:t>
+      </w:r>
+    </w:p>
+    <w:p>
+      <w:pPr>
+        <w:pStyle w:val="Heading2"/>
+        <w:spacing w:before="300" w:after="150"/>
+      </w:pPr>
+      <w:bookmarkStart w:id="16" w:name="_Toc239080362"/>
+      <w:r>
+        <w:rPr>
+          <w:b/>
+          <w:bCs/>
+          <w:color w:val="1F4E79"/>
+        </w:rPr>
+        <w:t>The One Thing to Verify</w:t>
+      </w:r>
+      <w:bookmarkEnd w:id="16"/>
+    </w:p>
+    <w:p>
+      <w:pPr>
+        <w:pStyle w:val="ListParagraph"/>
+        <w:numPr>
+          <w:ilvl w:val="0"/>
+          <w:numId w:val="1"/>
+        </w:numPr>
+        <w:spacing w:after="100" w:line="300" w:lineRule="auto"/>
+      </w:pPr>
+      <w:r>
+        <w:rPr>
+          <w:sz w:val="23"/>
+          <w:szCs w:val="23"/>
+        </w:rPr>
         <w:t>A packaged pipeline should reproduce the manually-built, selected model's numbers exactly, confirm this, don't assume it.</w:t>
+      </w:r>
+    </w:p>
+    <w:p>
+      <w:pPr>
+        <w:pStyle w:val="Heading2"/>
+        <w:spacing w:before="300" w:after="150"/>
+      </w:pPr>
+      <w:bookmarkStart w:id="17" w:name="_Toc239080363"/>
+      <w:r>
+        <w:rPr>
+          <w:b/>
+          <w:bCs/>
+          <w:color w:val="1F4E79"/>
+        </w:rPr>
+        <w:t>Traditional vs. Pipeline</w:t>
+      </w:r>
+      <w:bookmarkEnd w:id="17"/>
+    </w:p>
+    <w:p>
+      <w:pPr>
+        <w:pStyle w:val="ListParagraph"/>
+        <w:numPr>
+          <w:ilvl w:val="0"/>
+          <w:numId w:val="1"/>
+        </w:numPr>
+        <w:spacing w:after="100" w:line="300" w:lineRule="auto"/>
+      </w:pPr>
+      <w:r>
+        <w:rPr>
+          <w:sz w:val="23"/>
+          <w:szCs w:val="23"/>
+        </w:rPr>
+        <w:t>Traditional: more visible while debugging, but every step has to be remembered and repeated correctly by hand.</w:t>
+      </w:r>
+    </w:p>
+    <w:p>
+      <w:pPr>
+        <w:pStyle w:val="ListParagraph"/>
+        <w:numPr>
+          <w:ilvl w:val="0"/>
+          <w:numId w:val="1"/>
+        </w:numPr>
+        <w:spacing w:after="100" w:line="300" w:lineRule="auto"/>
+      </w:pPr>
+      <w:r>
+        <w:rPr>
+          <w:sz w:val="23"/>
+          <w:szCs w:val="23"/>
+        </w:rPr>
+        <w:t>Pipeline: bundles every step into one object; structurally prevents fitting a step (like an imputer) on the wrong data.</w:t>
       </w:r>
     </w:p>
     <w:sectPr>
@@ -2496,10 +3393,10 @@
 <file path=word/numbering.xml><?xml version="1.0" encoding="utf-8"?>
 <w:numbering xmlns:wpc="http://schemas.microsoft.com/office/word/2010/wordprocessingCanvas" xmlns:cx="http://schemas.microsoft.com/office/drawing/2014/chartex" xmlns:cx1="http://schemas.microsoft.com/office/drawing/2015/9/8/chartex" xmlns:cx2="http://schemas.microsoft.com/office/drawing/2015/10/21/chartex" xmlns:cx3="http://schemas.microsoft.com/office/drawing/2016/5/9/chartex" xmlns:cx4="http://schemas.microsoft.com/office/drawing/2016/5/10/chartex" xmlns:cx5="http://schemas.microsoft.com/office/drawing/2016/5/11/chartex" xmlns:cx6="http://schemas.microsoft.com/office/drawing/2016/5/12/chartex" xmlns:cx7="http://schemas.microsoft.com/office/drawing/2016/5/13/chartex" xmlns:cx8="http://schemas.microsoft.com/office/drawing/2016/5/14/chartex" xmlns:mc="http://schemas.openxmlformats.org/markup-compatibility/2006" xmlns:aink="http://schemas.microsoft.com/office/drawing/2016/ink" xmlns:am3d="http://schemas.microsoft.com/office/drawing/2017/model3d" xmlns:o="urn:schemas-microsoft-com:office:office" xmlns:oel="http://schemas.microsoft.com/office/2019/extlst" xmlns:r="http://schemas.openxmlformats.org/officeDocument/2006/relationships" xmlns:m="http://schemas.openxmlformats.org/officeDocument/2006/math" xmlns:v="urn:schemas-microsoft-com:vml" xmlns:wp14="http://schemas.microsoft.com/office/word/2010/wordprocessingDrawing" xmlns:wp="http://schemas.openxmlformats.org/drawingml/2006/wordprocessingDrawing" xmlns:w10="urn:schemas-microsoft-com:office:word" xmlns:w="http://schemas.openxmlformats.org/wordprocessingml/2006/main" xmlns:w14="http://schemas.microsoft.com/office/word/2010/wordml" xmlns:w15="http://schemas.microsoft.com/office/word/2012/wordml" xmlns:w16cex="http://schemas.microsoft.com/office/word/2018/wordml/cex" xmlns:w16cid="http://schemas.microsoft.com/office/word/2016/wordml/cid" xmlns:w16="http://schemas.microsoft.com/office/word/2018/wordml" xmlns:w16du="http://schemas.microsoft.com/office/word/2023/wordml/word16du" xmlns:w16sdtdh="http://schemas.microsoft.com/office/word/2020/wordml/sdtdatahash" xmlns:w16sdtfl="http://schemas.microsoft.com/office/word/2024/wordml/sdtformatlock" xmlns:w16se="http://schemas.microsoft.com/office/word/2015/wordml/symex" xmlns:wpg="http://schemas.microsoft.com/office/word/2010/wordprocessingGroup" xmlns:wpi="http://schemas.microsoft.com/office/word/2010/wordprocessingInk" xmlns:wne="http://schemas.microsoft.com/office/word/2006/wordml" xmlns:wps="http://schemas.microsoft.com/office/word/2010/wordprocessingShape" mc:Ignorable="w14 w15 w16se w16cid w16 w16cex w16sdtdh w16sdtfl w16du wp14">
   <w:abstractNum w:abstractNumId="0" w15:restartNumberingAfterBreak="0">
-    <w:nsid w:val="0F0F5359"/>
+    <w:nsid w:val="71AD43DC"/>
     <w:multiLevelType w:val="hybridMultilevel"/>
-    <w:tmpl w:val="2CF4EEF6"/>
-    <w:lvl w:ilvl="0" w:tplc="DDD270BC">
+    <w:tmpl w:val="7D405EB2"/>
+    <w:lvl w:ilvl="0" w:tplc="6E24CDFA">
       <w:start w:val="1"/>
       <w:numFmt w:val="bullet"/>
       <w:lvlText w:val="●"/>
@@ -2508,7 +3405,7 @@
         <w:ind w:left="720" w:hanging="360"/>
       </w:pPr>
     </w:lvl>
-    <w:lvl w:ilvl="1" w:tplc="5A4CB23C">
+    <w:lvl w:ilvl="1" w:tplc="67825168">
       <w:start w:val="1"/>
       <w:numFmt w:val="bullet"/>
       <w:lvlText w:val="○"/>
@@ -2517,7 +3414,7 @@
         <w:ind w:left="1440" w:hanging="360"/>
       </w:pPr>
     </w:lvl>
-    <w:lvl w:ilvl="2" w:tplc="28709FAE">
+    <w:lvl w:ilvl="2" w:tplc="6414E7A4">
       <w:start w:val="1"/>
       <w:numFmt w:val="bullet"/>
       <w:lvlText w:val="■"/>
@@ -2526,7 +3423,7 @@
         <w:ind w:left="2160" w:hanging="360"/>
       </w:pPr>
     </w:lvl>
-    <w:lvl w:ilvl="3" w:tplc="5F48D7AA">
+    <w:lvl w:ilvl="3" w:tplc="0838C756">
       <w:start w:val="1"/>
       <w:numFmt w:val="bullet"/>
       <w:lvlText w:val="●"/>
@@ -2535,7 +3432,7 @@
         <w:ind w:left="2880" w:hanging="360"/>
       </w:pPr>
     </w:lvl>
-    <w:lvl w:ilvl="4" w:tplc="229AF93E">
+    <w:lvl w:ilvl="4" w:tplc="CD7457F2">
       <w:start w:val="1"/>
       <w:numFmt w:val="bullet"/>
       <w:lvlText w:val="○"/>
@@ -2544,7 +3441,7 @@
         <w:ind w:left="3600" w:hanging="360"/>
       </w:pPr>
     </w:lvl>
-    <w:lvl w:ilvl="5" w:tplc="58D44B84">
+    <w:lvl w:ilvl="5" w:tplc="43881960">
       <w:start w:val="1"/>
       <w:numFmt w:val="bullet"/>
       <w:lvlText w:val="■"/>
@@ -2553,7 +3450,7 @@
         <w:ind w:left="4320" w:hanging="360"/>
       </w:pPr>
     </w:lvl>
-    <w:lvl w:ilvl="6" w:tplc="54E42D02">
+    <w:lvl w:ilvl="6" w:tplc="F6A6E300">
       <w:start w:val="1"/>
       <w:numFmt w:val="bullet"/>
       <w:lvlText w:val="●"/>
@@ -2562,7 +3459,7 @@
         <w:ind w:left="5040" w:hanging="360"/>
       </w:pPr>
     </w:lvl>
-    <w:lvl w:ilvl="7" w:tplc="3092CE00">
+    <w:lvl w:ilvl="7" w:tplc="235CDDE2">
       <w:start w:val="1"/>
       <w:numFmt w:val="bullet"/>
       <w:lvlText w:val="●"/>
@@ -2571,7 +3468,7 @@
         <w:ind w:left="5760" w:hanging="360"/>
       </w:pPr>
     </w:lvl>
-    <w:lvl w:ilvl="8" w:tplc="5A8C3518">
+    <w:lvl w:ilvl="8" w:tplc="D6EA5676">
       <w:start w:val="1"/>
       <w:numFmt w:val="bullet"/>
       <w:lvlText w:val="●"/>
@@ -2581,7 +3478,7 @@
       </w:pPr>
     </w:lvl>
   </w:abstractNum>
-  <w:num w:numId="1" w16cid:durableId="1081562295">
+  <w:num w:numId="1" w16cid:durableId="988900939">
     <w:abstractNumId w:val="0"/>
     <w:lvlOverride w:ilvl="0">
       <w:startOverride w:val="1"/>
@@ -3184,7 +4081,7 @@
     <w:autoRedefine/>
     <w:uiPriority w:val="39"/>
     <w:unhideWhenUsed/>
-    <w:rsid w:val="00900501"/>
+    <w:rsid w:val="000F7B32"/>
     <w:pPr>
       <w:spacing w:after="100"/>
     </w:pPr>
@@ -3196,7 +4093,7 @@
     <w:autoRedefine/>
     <w:uiPriority w:val="39"/>
     <w:unhideWhenUsed/>
-    <w:rsid w:val="00900501"/>
+    <w:rsid w:val="000F7B32"/>
     <w:pPr>
       <w:spacing w:after="100"/>
       <w:ind w:left="200"/>

</xml_diff>

<commit_message>
Restructure ML Pipelines: teach data leakage as its own section first
Adds a dedicated "Understanding Data Leakage" section (concept: any
statistic learned from data must be fit on train only, not just model
hyperparameters) before any modeling code, in both the notebook and
Teaching Notes. Step 1 is retitled "Split the Data, Then Build a Model"
to make the flow explicit: split -> base model -> hyperparameter tuning
-> pipeline. The earlier inline leakage explanation is trimmed to a
callback referencing the new section instead of re-explaining it.
No logic changes; numbers unchanged and re-verified (100%/81.7% base
tree, 82.7%/84.1% selected model and pipeline, exact match).
</commit_message>
<xml_diff>
--- a/ML Pipelines/ML Pipelines Teaching Notes.docx
+++ b/ML Pipelines/ML Pipelines Teaching Notes.docx
@@ -64,7 +64,7 @@
         <w:pStyle w:val="Heading1"/>
         <w:spacing w:before="400" w:after="200"/>
       </w:pPr>
-      <w:bookmarkStart w:id="0" w:name="_Toc239080346"/>
+      <w:bookmarkStart w:id="0" w:name="_Toc239093803"/>
       <w:r>
         <w:rPr>
           <w:b/>
@@ -79,7 +79,7 @@
     <w:sdt>
       <w:sdtPr>
         <w:alias w:val="Contents"/>
-        <w:id w:val="-1774618315"/>
+        <w:id w:val="1672603167"/>
       </w:sdtPr>
       <w:sdtEndPr/>
       <w:sdtContent>
@@ -107,7 +107,7 @@
           <w:r>
             <w:fldChar w:fldCharType="separate"/>
           </w:r>
-          <w:hyperlink w:anchor="_Toc239080346" w:history="1">
+          <w:hyperlink w:anchor="_Toc239093803" w:history="1">
             <w:r>
               <w:rPr>
                 <w:rStyle w:val="Hyperlink"/>
@@ -133,7 +133,7 @@
               <w:rPr>
                 <w:noProof/>
               </w:rPr>
-              <w:instrText xml:space="preserve"> PAGEREF _Toc239080346 \h </w:instrText>
+              <w:instrText xml:space="preserve"> PAGEREF _Toc239093803 \h </w:instrText>
             </w:r>
             <w:r>
               <w:rPr>
@@ -175,7 +175,7 @@
               <w14:ligatures w14:val="standardContextual"/>
             </w:rPr>
           </w:pPr>
-          <w:hyperlink w:anchor="_Toc239080347" w:history="1">
+          <w:hyperlink w:anchor="_Toc239093804" w:history="1">
             <w:r>
               <w:rPr>
                 <w:rStyle w:val="Hyperlink"/>
@@ -201,7 +201,7 @@
               <w:rPr>
                 <w:noProof/>
               </w:rPr>
-              <w:instrText xml:space="preserve"> PAGEREF _Toc239080347 \h </w:instrText>
+              <w:instrText xml:space="preserve"> PAGEREF _Toc239093804 \h </w:instrText>
             </w:r>
             <w:r>
               <w:rPr>
@@ -243,7 +243,7 @@
               <w14:ligatures w14:val="standardContextual"/>
             </w:rPr>
           </w:pPr>
-          <w:hyperlink w:anchor="_Toc239080348" w:history="1">
+          <w:hyperlink w:anchor="_Toc239093805" w:history="1">
             <w:r>
               <w:rPr>
                 <w:rStyle w:val="Hyperlink"/>
@@ -251,7 +251,7 @@
                 <w:bCs/>
                 <w:noProof/>
               </w:rPr>
-              <w:t>2. Build a Model the Normal Way First</w:t>
+              <w:t>2. Understanding Data Leakage</w:t>
             </w:r>
             <w:r>
               <w:rPr>
@@ -269,7 +269,75 @@
               <w:rPr>
                 <w:noProof/>
               </w:rPr>
-              <w:instrText xml:space="preserve"> PAGEREF _Toc239080348 \h </w:instrText>
+              <w:instrText xml:space="preserve"> PAGEREF _Toc239093805 \h </w:instrText>
+            </w:r>
+            <w:r>
+              <w:rPr>
+                <w:noProof/>
+              </w:rPr>
+            </w:r>
+            <w:r>
+              <w:rPr>
+                <w:noProof/>
+              </w:rPr>
+              <w:fldChar w:fldCharType="separate"/>
+            </w:r>
+            <w:r>
+              <w:rPr>
+                <w:noProof/>
+              </w:rPr>
+              <w:t>3</w:t>
+            </w:r>
+            <w:r>
+              <w:rPr>
+                <w:noProof/>
+              </w:rPr>
+              <w:fldChar w:fldCharType="end"/>
+            </w:r>
+          </w:hyperlink>
+        </w:p>
+        <w:p>
+          <w:pPr>
+            <w:pStyle w:val="TOC1"/>
+            <w:tabs>
+              <w:tab w:val="right" w:leader="dot" w:pos="9016"/>
+            </w:tabs>
+            <w:rPr>
+              <w:rFonts w:asciiTheme="minorHAnsi" w:eastAsiaTheme="minorEastAsia" w:hAnsiTheme="minorHAnsi" w:cstheme="minorBidi"/>
+              <w:noProof/>
+              <w:kern w:val="2"/>
+              <w:sz w:val="24"/>
+              <w:szCs w:val="24"/>
+              <w14:ligatures w14:val="standardContextual"/>
+            </w:rPr>
+          </w:pPr>
+          <w:hyperlink w:anchor="_Toc239093806" w:history="1">
+            <w:r>
+              <w:rPr>
+                <w:rStyle w:val="Hyperlink"/>
+                <w:b/>
+                <w:bCs/>
+                <w:noProof/>
+              </w:rPr>
+              <w:t>3. Split the Data, Then Build a Model the Normal Way</w:t>
+            </w:r>
+            <w:r>
+              <w:rPr>
+                <w:noProof/>
+              </w:rPr>
+              <w:tab/>
+            </w:r>
+            <w:r>
+              <w:rPr>
+                <w:noProof/>
+              </w:rPr>
+              <w:fldChar w:fldCharType="begin"/>
+            </w:r>
+            <w:r>
+              <w:rPr>
+                <w:noProof/>
+              </w:rPr>
+              <w:instrText xml:space="preserve"> PAGEREF _Toc239093806 \h </w:instrText>
             </w:r>
             <w:r>
               <w:rPr>
@@ -311,7 +379,7 @@
               <w14:ligatures w14:val="standardContextual"/>
             </w:rPr>
           </w:pPr>
-          <w:hyperlink w:anchor="_Toc239080349" w:history="1">
+          <w:hyperlink w:anchor="_Toc239093807" w:history="1">
             <w:r>
               <w:rPr>
                 <w:rStyle w:val="Hyperlink"/>
@@ -337,7 +405,7 @@
               <w:rPr>
                 <w:noProof/>
               </w:rPr>
-              <w:instrText xml:space="preserve"> PAGEREF _Toc239080349 \h </w:instrText>
+              <w:instrText xml:space="preserve"> PAGEREF _Toc239093807 \h </w:instrText>
             </w:r>
             <w:r>
               <w:rPr>
@@ -354,7 +422,7 @@
               <w:rPr>
                 <w:noProof/>
               </w:rPr>
-              <w:t>3</w:t>
+              <w:t>4</w:t>
             </w:r>
             <w:r>
               <w:rPr>
@@ -379,7 +447,7 @@
               <w14:ligatures w14:val="standardContextual"/>
             </w:rPr>
           </w:pPr>
-          <w:hyperlink w:anchor="_Toc239080350" w:history="1">
+          <w:hyperlink w:anchor="_Toc239093808" w:history="1">
             <w:r>
               <w:rPr>
                 <w:rStyle w:val="Hyperlink"/>
@@ -405,7 +473,7 @@
               <w:rPr>
                 <w:noProof/>
               </w:rPr>
-              <w:instrText xml:space="preserve"> PAGEREF _Toc239080350 \h </w:instrText>
+              <w:instrText xml:space="preserve"> PAGEREF _Toc239093808 \h </w:instrText>
             </w:r>
             <w:r>
               <w:rPr>
@@ -422,7 +490,7 @@
               <w:rPr>
                 <w:noProof/>
               </w:rPr>
-              <w:t>3</w:t>
+              <w:t>4</w:t>
             </w:r>
             <w:r>
               <w:rPr>
@@ -447,7 +515,7 @@
               <w14:ligatures w14:val="standardContextual"/>
             </w:rPr>
           </w:pPr>
-          <w:hyperlink w:anchor="_Toc239080351" w:history="1">
+          <w:hyperlink w:anchor="_Toc239093809" w:history="1">
             <w:r>
               <w:rPr>
                 <w:rStyle w:val="Hyperlink"/>
@@ -455,7 +523,7 @@
                 <w:bCs/>
                 <w:noProof/>
               </w:rPr>
-              <w:t>3. What a Pipeline Actually Is</w:t>
+              <w:t>4. What a Pipeline Actually Is</w:t>
             </w:r>
             <w:r>
               <w:rPr>
@@ -473,7 +541,7 @@
               <w:rPr>
                 <w:noProof/>
               </w:rPr>
-              <w:instrText xml:space="preserve"> PAGEREF _Toc239080351 \h </w:instrText>
+              <w:instrText xml:space="preserve"> PAGEREF _Toc239093809 \h </w:instrText>
             </w:r>
             <w:r>
               <w:rPr>
@@ -490,7 +558,7 @@
               <w:rPr>
                 <w:noProof/>
               </w:rPr>
-              <w:t>4</w:t>
+              <w:t>5</w:t>
             </w:r>
             <w:r>
               <w:rPr>
@@ -515,7 +583,7 @@
               <w14:ligatures w14:val="standardContextual"/>
             </w:rPr>
           </w:pPr>
-          <w:hyperlink w:anchor="_Toc239080352" w:history="1">
+          <w:hyperlink w:anchor="_Toc239093810" w:history="1">
             <w:r>
               <w:rPr>
                 <w:rStyle w:val="Hyperlink"/>
@@ -523,7 +591,7 @@
                 <w:bCs/>
                 <w:noProof/>
               </w:rPr>
-              <w:t>4. Packaging the Selected Model</w:t>
+              <w:t>5. Packaging the Selected Model</w:t>
             </w:r>
             <w:r>
               <w:rPr>
@@ -541,7 +609,7 @@
               <w:rPr>
                 <w:noProof/>
               </w:rPr>
-              <w:instrText xml:space="preserve"> PAGEREF _Toc239080352 \h </w:instrText>
+              <w:instrText xml:space="preserve"> PAGEREF _Toc239093810 \h </w:instrText>
             </w:r>
             <w:r>
               <w:rPr>
@@ -583,7 +651,7 @@
               <w14:ligatures w14:val="standardContextual"/>
             </w:rPr>
           </w:pPr>
-          <w:hyperlink w:anchor="_Toc239080353" w:history="1">
+          <w:hyperlink w:anchor="_Toc239093811" w:history="1">
             <w:r>
               <w:rPr>
                 <w:rStyle w:val="Hyperlink"/>
@@ -591,7 +659,7 @@
                 <w:bCs/>
                 <w:noProof/>
               </w:rPr>
-              <w:t>5. Adding Feature Engineering, No Custom Class Required</w:t>
+              <w:t>6. Adding Feature Engineering, No Custom Class Required</w:t>
             </w:r>
             <w:r>
               <w:rPr>
@@ -609,7 +677,7 @@
               <w:rPr>
                 <w:noProof/>
               </w:rPr>
-              <w:instrText xml:space="preserve"> PAGEREF _Toc239080353 \h </w:instrText>
+              <w:instrText xml:space="preserve"> PAGEREF _Toc239093811 \h </w:instrText>
             </w:r>
             <w:r>
               <w:rPr>
@@ -626,7 +694,7 @@
               <w:rPr>
                 <w:noProof/>
               </w:rPr>
-              <w:t>5</w:t>
+              <w:t>6</w:t>
             </w:r>
             <w:r>
               <w:rPr>
@@ -651,7 +719,7 @@
               <w14:ligatures w14:val="standardContextual"/>
             </w:rPr>
           </w:pPr>
-          <w:hyperlink w:anchor="_Toc239080354" w:history="1">
+          <w:hyperlink w:anchor="_Toc239093812" w:history="1">
             <w:r>
               <w:rPr>
                 <w:rStyle w:val="Hyperlink"/>
@@ -677,7 +745,7 @@
               <w:rPr>
                 <w:noProof/>
               </w:rPr>
-              <w:instrText xml:space="preserve"> PAGEREF _Toc239080354 \h </w:instrText>
+              <w:instrText xml:space="preserve"> PAGEREF _Toc239093812 \h </w:instrText>
             </w:r>
             <w:r>
               <w:rPr>
@@ -719,7 +787,7 @@
               <w14:ligatures w14:val="standardContextual"/>
             </w:rPr>
           </w:pPr>
-          <w:hyperlink w:anchor="_Toc239080355" w:history="1">
+          <w:hyperlink w:anchor="_Toc239093813" w:history="1">
             <w:r>
               <w:rPr>
                 <w:rStyle w:val="Hyperlink"/>
@@ -727,7 +795,7 @@
                 <w:bCs/>
                 <w:noProof/>
               </w:rPr>
-              <w:t>6. Tuning a Pipeline Directly</w:t>
+              <w:t>7. Tuning a Pipeline Directly</w:t>
             </w:r>
             <w:r>
               <w:rPr>
@@ -745,7 +813,7 @@
               <w:rPr>
                 <w:noProof/>
               </w:rPr>
-              <w:instrText xml:space="preserve"> PAGEREF _Toc239080355 \h </w:instrText>
+              <w:instrText xml:space="preserve"> PAGEREF _Toc239093813 \h </w:instrText>
             </w:r>
             <w:r>
               <w:rPr>
@@ -787,7 +855,7 @@
               <w14:ligatures w14:val="standardContextual"/>
             </w:rPr>
           </w:pPr>
-          <w:hyperlink w:anchor="_Toc239080356" w:history="1">
+          <w:hyperlink w:anchor="_Toc239093814" w:history="1">
             <w:r>
               <w:rPr>
                 <w:rStyle w:val="Hyperlink"/>
@@ -795,7 +863,7 @@
                 <w:bCs/>
                 <w:noProof/>
               </w:rPr>
-              <w:t>7. Traditional Method vs. Pipeline: Side by Side</w:t>
+              <w:t>8. Traditional Method vs. Pipeline: Side by Side</w:t>
             </w:r>
             <w:r>
               <w:rPr>
@@ -813,7 +881,7 @@
               <w:rPr>
                 <w:noProof/>
               </w:rPr>
-              <w:instrText xml:space="preserve"> PAGEREF _Toc239080356 \h </w:instrText>
+              <w:instrText xml:space="preserve"> PAGEREF _Toc239093814 \h </w:instrText>
             </w:r>
             <w:r>
               <w:rPr>
@@ -830,7 +898,7 @@
               <w:rPr>
                 <w:noProof/>
               </w:rPr>
-              <w:t>6</w:t>
+              <w:t>7</w:t>
             </w:r>
             <w:r>
               <w:rPr>
@@ -855,7 +923,7 @@
               <w14:ligatures w14:val="standardContextual"/>
             </w:rPr>
           </w:pPr>
-          <w:hyperlink w:anchor="_Toc239080357" w:history="1">
+          <w:hyperlink w:anchor="_Toc239093815" w:history="1">
             <w:r>
               <w:rPr>
                 <w:rStyle w:val="Hyperlink"/>
@@ -863,7 +931,7 @@
                 <w:bCs/>
                 <w:noProof/>
               </w:rPr>
-              <w:t>8. Practical Guidance</w:t>
+              <w:t>9. Practical Guidance</w:t>
             </w:r>
             <w:r>
               <w:rPr>
@@ -881,7 +949,7 @@
               <w:rPr>
                 <w:noProof/>
               </w:rPr>
-              <w:instrText xml:space="preserve"> PAGEREF _Toc239080357 \h </w:instrText>
+              <w:instrText xml:space="preserve"> PAGEREF _Toc239093815 \h </w:instrText>
             </w:r>
             <w:r>
               <w:rPr>
@@ -923,7 +991,7 @@
               <w14:ligatures w14:val="standardContextual"/>
             </w:rPr>
           </w:pPr>
-          <w:hyperlink w:anchor="_Toc239080358" w:history="1">
+          <w:hyperlink w:anchor="_Toc239093816" w:history="1">
             <w:r>
               <w:rPr>
                 <w:rStyle w:val="Hyperlink"/>
@@ -949,7 +1017,7 @@
               <w:rPr>
                 <w:noProof/>
               </w:rPr>
-              <w:instrText xml:space="preserve"> PAGEREF _Toc239080358 \h </w:instrText>
+              <w:instrText xml:space="preserve"> PAGEREF _Toc239093816 \h </w:instrText>
             </w:r>
             <w:r>
               <w:rPr>
@@ -966,7 +1034,7 @@
               <w:rPr>
                 <w:noProof/>
               </w:rPr>
-              <w:t>7</w:t>
+              <w:t>8</w:t>
             </w:r>
             <w:r>
               <w:rPr>
@@ -991,7 +1059,7 @@
               <w14:ligatures w14:val="standardContextual"/>
             </w:rPr>
           </w:pPr>
-          <w:hyperlink w:anchor="_Toc239080359" w:history="1">
+          <w:hyperlink w:anchor="_Toc239093817" w:history="1">
             <w:r>
               <w:rPr>
                 <w:rStyle w:val="Hyperlink"/>
@@ -999,7 +1067,7 @@
                 <w:bCs/>
                 <w:noProof/>
               </w:rPr>
-              <w:t>What a Pipeline Is</w:t>
+              <w:t>Data Leakage</w:t>
             </w:r>
             <w:r>
               <w:rPr>
@@ -1017,7 +1085,7 @@
               <w:rPr>
                 <w:noProof/>
               </w:rPr>
-              <w:instrText xml:space="preserve"> PAGEREF _Toc239080359 \h </w:instrText>
+              <w:instrText xml:space="preserve"> PAGEREF _Toc239093817 \h </w:instrText>
             </w:r>
             <w:r>
               <w:rPr>
@@ -1034,7 +1102,7 @@
               <w:rPr>
                 <w:noProof/>
               </w:rPr>
-              <w:t>7</w:t>
+              <w:t>8</w:t>
             </w:r>
             <w:r>
               <w:rPr>
@@ -1059,7 +1127,7 @@
               <w14:ligatures w14:val="standardContextual"/>
             </w:rPr>
           </w:pPr>
-          <w:hyperlink w:anchor="_Toc239080360" w:history="1">
+          <w:hyperlink w:anchor="_Toc239093818" w:history="1">
             <w:r>
               <w:rPr>
                 <w:rStyle w:val="Hyperlink"/>
@@ -1067,7 +1135,7 @@
                 <w:bCs/>
                 <w:noProof/>
               </w:rPr>
-              <w:t>Building Blocks Used Here</w:t>
+              <w:t>What a Pipeline Is</w:t>
             </w:r>
             <w:r>
               <w:rPr>
@@ -1085,7 +1153,7 @@
               <w:rPr>
                 <w:noProof/>
               </w:rPr>
-              <w:instrText xml:space="preserve"> PAGEREF _Toc239080360 \h </w:instrText>
+              <w:instrText xml:space="preserve"> PAGEREF _Toc239093818 \h </w:instrText>
             </w:r>
             <w:r>
               <w:rPr>
@@ -1127,7 +1195,7 @@
               <w14:ligatures w14:val="standardContextual"/>
             </w:rPr>
           </w:pPr>
-          <w:hyperlink w:anchor="_Toc239080361" w:history="1">
+          <w:hyperlink w:anchor="_Toc239093819" w:history="1">
             <w:r>
               <w:rPr>
                 <w:rStyle w:val="Hyperlink"/>
@@ -1135,7 +1203,7 @@
                 <w:bCs/>
                 <w:noProof/>
               </w:rPr>
-              <w:t>Tuning</w:t>
+              <w:t>Building Blocks Used Here</w:t>
             </w:r>
             <w:r>
               <w:rPr>
@@ -1153,7 +1221,7 @@
               <w:rPr>
                 <w:noProof/>
               </w:rPr>
-              <w:instrText xml:space="preserve"> PAGEREF _Toc239080361 \h </w:instrText>
+              <w:instrText xml:space="preserve"> PAGEREF _Toc239093819 \h </w:instrText>
             </w:r>
             <w:r>
               <w:rPr>
@@ -1195,7 +1263,7 @@
               <w14:ligatures w14:val="standardContextual"/>
             </w:rPr>
           </w:pPr>
-          <w:hyperlink w:anchor="_Toc239080362" w:history="1">
+          <w:hyperlink w:anchor="_Toc239093820" w:history="1">
             <w:r>
               <w:rPr>
                 <w:rStyle w:val="Hyperlink"/>
@@ -1203,7 +1271,7 @@
                 <w:bCs/>
                 <w:noProof/>
               </w:rPr>
-              <w:t>The One Thing to Verify</w:t>
+              <w:t>Tuning</w:t>
             </w:r>
             <w:r>
               <w:rPr>
@@ -1221,7 +1289,7 @@
               <w:rPr>
                 <w:noProof/>
               </w:rPr>
-              <w:instrText xml:space="preserve"> PAGEREF _Toc239080362 \h </w:instrText>
+              <w:instrText xml:space="preserve"> PAGEREF _Toc239093820 \h </w:instrText>
             </w:r>
             <w:r>
               <w:rPr>
@@ -1263,7 +1331,7 @@
               <w14:ligatures w14:val="standardContextual"/>
             </w:rPr>
           </w:pPr>
-          <w:hyperlink w:anchor="_Toc239080363" w:history="1">
+          <w:hyperlink w:anchor="_Toc239093821" w:history="1">
             <w:r>
               <w:rPr>
                 <w:rStyle w:val="Hyperlink"/>
@@ -1271,6 +1339,74 @@
                 <w:bCs/>
                 <w:noProof/>
               </w:rPr>
+              <w:t>The One Thing to Verify</w:t>
+            </w:r>
+            <w:r>
+              <w:rPr>
+                <w:noProof/>
+              </w:rPr>
+              <w:tab/>
+            </w:r>
+            <w:r>
+              <w:rPr>
+                <w:noProof/>
+              </w:rPr>
+              <w:fldChar w:fldCharType="begin"/>
+            </w:r>
+            <w:r>
+              <w:rPr>
+                <w:noProof/>
+              </w:rPr>
+              <w:instrText xml:space="preserve"> PAGEREF _Toc239093821 \h </w:instrText>
+            </w:r>
+            <w:r>
+              <w:rPr>
+                <w:noProof/>
+              </w:rPr>
+            </w:r>
+            <w:r>
+              <w:rPr>
+                <w:noProof/>
+              </w:rPr>
+              <w:fldChar w:fldCharType="separate"/>
+            </w:r>
+            <w:r>
+              <w:rPr>
+                <w:noProof/>
+              </w:rPr>
+              <w:t>8</w:t>
+            </w:r>
+            <w:r>
+              <w:rPr>
+                <w:noProof/>
+              </w:rPr>
+              <w:fldChar w:fldCharType="end"/>
+            </w:r>
+          </w:hyperlink>
+        </w:p>
+        <w:p>
+          <w:pPr>
+            <w:pStyle w:val="TOC2"/>
+            <w:tabs>
+              <w:tab w:val="right" w:leader="dot" w:pos="9016"/>
+            </w:tabs>
+            <w:rPr>
+              <w:rFonts w:asciiTheme="minorHAnsi" w:eastAsiaTheme="minorEastAsia" w:hAnsiTheme="minorHAnsi" w:cstheme="minorBidi"/>
+              <w:noProof/>
+              <w:kern w:val="2"/>
+              <w:sz w:val="24"/>
+              <w:szCs w:val="24"/>
+              <w14:ligatures w14:val="standardContextual"/>
+            </w:rPr>
+          </w:pPr>
+          <w:hyperlink w:anchor="_Toc239093822" w:history="1">
+            <w:r>
+              <w:rPr>
+                <w:rStyle w:val="Hyperlink"/>
+                <w:b/>
+                <w:bCs/>
+                <w:noProof/>
+              </w:rPr>
               <w:t>Traditional vs. Pipeline</w:t>
             </w:r>
             <w:r>
@@ -1289,7 +1425,7 @@
               <w:rPr>
                 <w:noProof/>
               </w:rPr>
-              <w:instrText xml:space="preserve"> PAGEREF _Toc239080363 \h </w:instrText>
+              <w:instrText xml:space="preserve"> PAGEREF _Toc239093822 \h </w:instrText>
             </w:r>
             <w:r>
               <w:rPr>
@@ -1333,7 +1469,7 @@
         <w:pStyle w:val="Heading1"/>
         <w:spacing w:before="400" w:after="200"/>
       </w:pPr>
-      <w:bookmarkStart w:id="1" w:name="_Toc239080347"/>
+      <w:bookmarkStart w:id="1" w:name="_Toc239093804"/>
       <w:r>
         <w:rPr>
           <w:b/>
@@ -1403,16 +1539,97 @@
         <w:pStyle w:val="Heading1"/>
         <w:spacing w:before="400" w:after="200"/>
       </w:pPr>
-      <w:bookmarkStart w:id="2" w:name="_Toc239080348"/>
+      <w:bookmarkStart w:id="2" w:name="_Toc239093805"/>
       <w:r>
         <w:rPr>
           <w:b/>
           <w:bCs/>
           <w:color w:val="8B4513"/>
         </w:rPr>
-        <w:t>2. Build a Model the Normal Way First</w:t>
+        <w:t>2. Understanding Data Leakage</w:t>
       </w:r>
       <w:bookmarkEnd w:id="2"/>
+    </w:p>
+    <w:p>
+      <w:pPr>
+        <w:spacing w:after="160" w:line="300" w:lineRule="auto"/>
+      </w:pPr>
+      <w:r>
+        <w:rPr>
+          <w:sz w:val="23"/>
+          <w:szCs w:val="23"/>
+        </w:rPr>
+        <w:t>Before writing any modeling code: data leakage is when information that would not actually be available at prediction time quietly influences training, making a model look better during evaluation than it will ever perform in reality.</w:t>
+      </w:r>
+    </w:p>
+    <w:p>
+      <w:pPr>
+        <w:spacing w:after="160" w:line="300" w:lineRule="auto"/>
+      </w:pPr>
+      <w:r>
+        <w:rPr>
+          <w:sz w:val="23"/>
+          <w:szCs w:val="23"/>
+        </w:rPr>
+        <w:t>The most obvious form is leaking the target itself, using a column that is only known after the outcome happened. A subtler, easy-to-miss form is leaking through preprocessing: any statistic learned from data, a mean, a median, a mode, a category's frequency, is exactly as much a "learned value" as a model's coefficients are. If that statistic is computed from the full dataset (train and test combined) and only then is the data split, the test rows have already quietly shaped a value used on the training ro</w:t>
+      </w:r>
+      <w:r>
+        <w:rPr>
+          <w:sz w:val="23"/>
+          <w:szCs w:val="23"/>
+        </w:rPr>
+        <w:t>ws, and vice versa. The evaluation on that "test" set is no longer a fair preview of unseen data, because the preprocessing already peeked at it.</w:t>
+      </w:r>
+    </w:p>
+    <w:p>
+      <w:pPr>
+        <w:pBdr>
+          <w:top w:val="single" w:sz="4" w:space="0" w:color="D8CFC0"/>
+          <w:left w:val="single" w:sz="4" w:space="0" w:color="D8CFC0"/>
+          <w:bottom w:val="single" w:sz="4" w:space="0" w:color="D8CFC0"/>
+          <w:right w:val="single" w:sz="4" w:space="0" w:color="D8CFC0"/>
+        </w:pBdr>
+        <w:shd w:val="clear" w:color="auto" w:fill="F2EEE6"/>
+        <w:spacing w:before="150" w:after="200"/>
+        <w:jc w:val="center"/>
+      </w:pPr>
+      <w:r>
+        <w:rPr>
+          <w:i/>
+          <w:iCs/>
+          <w:sz w:val="26"/>
+          <w:szCs w:val="26"/>
+        </w:rPr>
+        <w:t>Fit every learned statistic on the training split only. Apply it, unchanged, to test.</w:t>
+      </w:r>
+    </w:p>
+    <w:p>
+      <w:pPr>
+        <w:spacing w:after="160" w:line="300" w:lineRule="auto"/>
+      </w:pPr>
+      <w:r>
+        <w:rPr>
+          <w:sz w:val="23"/>
+          <w:szCs w:val="23"/>
+        </w:rPr>
+        <w:t>This is why the very first thing done with this dataset, before any feature engineering, before imputing a single missing value, before encoding a single category, is splitting it into train and test. Everything that follows (the median used to fill Credit_Amount, the mode used to fill Job, the categories pd.get_dummies learns) is fit on the training split alone.</w:t>
+      </w:r>
+    </w:p>
+    <w:p>
+      <w:pPr>
+        <w:pStyle w:val="Heading1"/>
+        <w:spacing w:before="400" w:after="200"/>
+      </w:pPr>
+      <w:bookmarkStart w:id="3" w:name="_Toc239093806"/>
+      <w:r>
+        <w:rPr>
+          <w:b/>
+          <w:bCs/>
+          <w:color w:val="8B4513"/>
+        </w:rPr>
+        <w:t>3. Split the Data, Then Build a Model the Normal Way</w:t>
+      </w:r>
+      <w:bookmarkEnd w:id="3"/>
     </w:p>
     <w:p>
       <w:pPr>
@@ -1443,16 +1660,17 @@
         <w:pStyle w:val="Heading2"/>
         <w:spacing w:before="300" w:after="150"/>
       </w:pPr>
-      <w:bookmarkStart w:id="3" w:name="_Toc239080349"/>
+      <w:bookmarkStart w:id="4" w:name="_Toc239093807"/>
       <w:r>
         <w:rPr>
           <w:b/>
           <w:bCs/>
           <w:color w:val="1F4E79"/>
         </w:rPr>
+        <w:lastRenderedPageBreak/>
         <w:t>Step 1: Split, Then Engineer, Impute, Encode, Train</w:t>
       </w:r>
-      <w:bookmarkEnd w:id="3"/>
+      <w:bookmarkEnd w:id="4"/>
     </w:p>
     <w:p>
       <w:pPr>
@@ -1548,7 +1766,7 @@
           <w:sz w:val="23"/>
           <w:szCs w:val="23"/>
         </w:rPr>
-        <w:t>That first bullet matters more than it looks. A median or a mode is a statistic learned from data, exactly like a model's coefficients, so it has to be learned from the training rows only. An earlier draft of this case study imputed on the full dataset before splitting, which lets the fill values used on training rows be quietly informed by test rows too, a real leakage risk, not a hypothetical one. Splitting first, then computing the median/mode from the training split alone, closes that gap.</w:t>
+        <w:t>That first bullet is Section 2 put into practice: an earlier draft of this case study imputed on the full dataset before splitting, a real leakage bug, not a hypothetical one. Splitting first, then computing the median/mode from the training split alone, is the fix.</w:t>
       </w:r>
     </w:p>
     <w:p>
@@ -1556,7 +1774,7 @@
         <w:pStyle w:val="Heading2"/>
         <w:spacing w:before="300" w:after="150"/>
       </w:pPr>
-      <w:bookmarkStart w:id="4" w:name="_Toc239080350"/>
+      <w:bookmarkStart w:id="5" w:name="_Toc239093808"/>
       <w:r>
         <w:rPr>
           <w:b/>
@@ -1565,7 +1783,7 @@
         </w:rPr>
         <w:t>Step 2 and 3: Tune, Then Select</w:t>
       </w:r>
-      <w:bookmarkEnd w:id="4"/>
+      <w:bookmarkEnd w:id="5"/>
     </w:p>
     <w:p>
       <w:pPr>
@@ -1576,7 +1794,6 @@
           <w:sz w:val="23"/>
           <w:szCs w:val="23"/>
         </w:rPr>
-        <w:lastRenderedPageBreak/>
         <w:t>GridSearchCV searches over max_depth and min_samples_leaf, scored by recall, and grid_search.best_estimator_ is the model actually selected.</w:t>
       </w:r>
     </w:p>
@@ -1604,7 +1821,7 @@
           <w:noProof/>
         </w:rPr>
         <w:drawing>
-          <wp:inline distT="0" distB="0" distL="0" distR="0" wp14:anchorId="1ADB550A" wp14:editId="6B5A2EA1">
+          <wp:inline distT="0" distB="0" distL="0" distR="0" wp14:anchorId="4F77C4A3" wp14:editId="40BF7D4D">
             <wp:extent cx="5852160" cy="3566160"/>
             <wp:effectExtent l="0" t="0" r="0" b="0"/>
             <wp:docPr id="1" name="Picture 1"/>
@@ -1660,16 +1877,17 @@
         <w:pStyle w:val="Heading1"/>
         <w:spacing w:before="400" w:after="200"/>
       </w:pPr>
-      <w:bookmarkStart w:id="5" w:name="_Toc239080351"/>
+      <w:bookmarkStart w:id="6" w:name="_Toc239093809"/>
       <w:r>
         <w:rPr>
           <w:b/>
           <w:bCs/>
           <w:color w:val="8B4513"/>
         </w:rPr>
-        <w:t>3. What a Pipeline Actually Is</w:t>
-      </w:r>
-      <w:bookmarkEnd w:id="5"/>
+        <w:lastRenderedPageBreak/>
+        <w:t>4. What a Pipeline Actually Is</w:t>
+      </w:r>
+      <w:bookmarkEnd w:id="6"/>
     </w:p>
     <w:p>
       <w:pPr>
@@ -1718,12 +1936,11 @@
         <w:rPr>
           <w:noProof/>
         </w:rPr>
-        <w:lastRenderedPageBreak/>
         <w:drawing>
-          <wp:inline distT="0" distB="0" distL="0" distR="0" wp14:anchorId="7DBBDA0F" wp14:editId="2AA97028">
+          <wp:inline distT="0" distB="0" distL="0" distR="0" wp14:anchorId="0D36D5E2" wp14:editId="0BB7E997">
             <wp:extent cx="5943600" cy="1828800"/>
             <wp:effectExtent l="0" t="0" r="0" b="0"/>
-            <wp:docPr id="1430058631" name="Picture 1430058631"/>
+            <wp:docPr id="287595053" name="Picture 287595053"/>
             <wp:cNvGraphicFramePr>
               <a:graphicFrameLocks xmlns:a="http://schemas.openxmlformats.org/drawingml/2006/main" noChangeAspect="1"/>
             </wp:cNvGraphicFramePr>
@@ -1764,16 +1981,16 @@
         <w:pStyle w:val="Heading1"/>
         <w:spacing w:before="400" w:after="200"/>
       </w:pPr>
-      <w:bookmarkStart w:id="6" w:name="_Toc239080352"/>
+      <w:bookmarkStart w:id="7" w:name="_Toc239093810"/>
       <w:r>
         <w:rPr>
           <w:b/>
           <w:bCs/>
           <w:color w:val="8B4513"/>
         </w:rPr>
-        <w:t>4. Packaging the Selected Model</w:t>
-      </w:r>
-      <w:bookmarkEnd w:id="6"/>
+        <w:t>5. Packaging the Selected Model</w:t>
+      </w:r>
+      <w:bookmarkEnd w:id="7"/>
     </w:p>
     <w:p>
       <w:pPr>
@@ -1802,7 +2019,7 @@
           <w:left w:w="10" w:type="dxa"/>
           <w:right w:w="10" w:type="dxa"/>
         </w:tblCellMar>
-        <w:tblLook w:val="04A0" w:firstRow="1" w:lastRow="0" w:firstColumn="1" w:lastColumn="0" w:noHBand="0" w:noVBand="1"/>
+        <w:tblLook w:val="0000" w:firstRow="0" w:lastRow="0" w:firstColumn="0" w:lastColumn="0" w:noHBand="0" w:noVBand="0"/>
       </w:tblPr>
       <w:tblGrid>
         <w:gridCol w:w="3200"/>
@@ -2127,16 +2344,17 @@
         <w:pStyle w:val="Heading1"/>
         <w:spacing w:before="400" w:after="200"/>
       </w:pPr>
-      <w:bookmarkStart w:id="7" w:name="_Toc239080353"/>
+      <w:bookmarkStart w:id="8" w:name="_Toc239093811"/>
       <w:r>
         <w:rPr>
           <w:b/>
           <w:bCs/>
           <w:color w:val="8B4513"/>
         </w:rPr>
-        <w:t>5. Adding Feature Engineering, No Custom Class Required</w:t>
-      </w:r>
-      <w:bookmarkEnd w:id="7"/>
+        <w:lastRenderedPageBreak/>
+        <w:t>6. Adding Feature Engineering, No Custom Class Required</w:t>
+      </w:r>
+      <w:bookmarkEnd w:id="8"/>
     </w:p>
     <w:p>
       <w:pPr>
@@ -2193,7 +2411,6 @@
           <w:sz w:val="23"/>
           <w:szCs w:val="23"/>
         </w:rPr>
-        <w:lastRenderedPageBreak/>
         <w:t>add_amount_per_month here is just a plain function that takes a dataframe in and returns a dataframe with one new column, nothing pipeline-specific about it at all. FunctionTransformer is the adapter that lets an ordinary function sit inside a pipeline.</w:t>
       </w:r>
     </w:p>
@@ -2202,7 +2419,7 @@
         <w:pStyle w:val="Heading2"/>
         <w:spacing w:before="300" w:after="150"/>
       </w:pPr>
-      <w:bookmarkStart w:id="8" w:name="_Toc239080354"/>
+      <w:bookmarkStart w:id="9" w:name="_Toc239093812"/>
       <w:r>
         <w:rPr>
           <w:b/>
@@ -2211,7 +2428,7 @@
         </w:rPr>
         <w:t>A Subtle but Important Detail: Order</w:t>
       </w:r>
-      <w:bookmarkEnd w:id="8"/>
+      <w:bookmarkEnd w:id="9"/>
     </w:p>
     <w:p>
       <w:pPr>
@@ -2237,16 +2454,16 @@
         <w:pStyle w:val="Heading1"/>
         <w:spacing w:before="400" w:after="200"/>
       </w:pPr>
-      <w:bookmarkStart w:id="9" w:name="_Toc239080355"/>
+      <w:bookmarkStart w:id="10" w:name="_Toc239093813"/>
       <w:r>
         <w:rPr>
           <w:b/>
           <w:bCs/>
           <w:color w:val="8B4513"/>
         </w:rPr>
-        <w:t>6. Tuning a Pipeline Directly</w:t>
-      </w:r>
-      <w:bookmarkEnd w:id="9"/>
+        <w:t>7. Tuning a Pipeline Directly</w:t>
+      </w:r>
+      <w:bookmarkEnd w:id="10"/>
     </w:p>
     <w:p>
       <w:pPr>
@@ -2318,16 +2535,17 @@
         <w:pStyle w:val="Heading1"/>
         <w:spacing w:before="400" w:after="200"/>
       </w:pPr>
-      <w:bookmarkStart w:id="10" w:name="_Toc239080356"/>
+      <w:bookmarkStart w:id="11" w:name="_Toc239093814"/>
       <w:r>
         <w:rPr>
           <w:b/>
           <w:bCs/>
           <w:color w:val="8B4513"/>
         </w:rPr>
-        <w:t>7. Traditional Method vs. Pipeline: Side by Side</w:t>
-      </w:r>
-      <w:bookmarkEnd w:id="10"/>
+        <w:lastRenderedPageBreak/>
+        <w:t>8. Traditional Method vs. Pipeline: Side by Side</w:t>
+      </w:r>
+      <w:bookmarkEnd w:id="11"/>
     </w:p>
     <w:tbl>
       <w:tblPr>
@@ -2344,7 +2562,7 @@
           <w:left w:w="10" w:type="dxa"/>
           <w:right w:w="10" w:type="dxa"/>
         </w:tblCellMar>
-        <w:tblLook w:val="04A0" w:firstRow="1" w:lastRow="0" w:firstColumn="1" w:lastColumn="0" w:noHBand="0" w:noVBand="1"/>
+        <w:tblLook w:val="0000" w:firstRow="0" w:lastRow="0" w:firstColumn="0" w:lastColumn="0" w:noHBand="0" w:noVBand="0"/>
       </w:tblPr>
       <w:tblGrid>
         <w:gridCol w:w="2600"/>
@@ -2665,15 +2883,7 @@
                 <w:sz w:val="21"/>
                 <w:szCs w:val="21"/>
               </w:rPr>
-              <w:t xml:space="preserve">Real, and easy to get wrong, imputing before splitting (as an earlier draft here actually did) </w:t>
-            </w:r>
-            <w:r>
-              <w:rPr>
-                <w:sz w:val="21"/>
-                <w:szCs w:val="21"/>
-              </w:rPr>
-              <w:lastRenderedPageBreak/>
-              <w:t>silently lets test rows influence training-time fill values</w:t>
+              <w:t>Real, and easy to get wrong, imputing before splitting (as an earlier draft here actually did) silently lets test rows influence training-time fill values</w:t>
             </w:r>
           </w:p>
         </w:tc>
@@ -2698,7 +2908,6 @@
                 <w:sz w:val="21"/>
                 <w:szCs w:val="21"/>
               </w:rPr>
-              <w:lastRenderedPageBreak/>
               <w:t>Structurally harder to leak: a step only ever sees whatever is passed to fit()</w:t>
             </w:r>
           </w:p>
@@ -2968,7 +3177,7 @@
           <w:sz w:val="23"/>
           <w:szCs w:val="23"/>
         </w:rPr>
-        <w:t>That last row is a genuine trade-off, not just an advantage for pipelines. While building this case study, seeing the imputed and encoded dataframes as separate, inspectable objects is exactly what made it possible to notice, and fix, the leakage bug described in Section 2, a mistake that would have been easier to miss inside a pipeline's hidden intermediate steps. Pipelines remove a category of mistakes at the cost of some of that step-by-step visibility: prototype and debug with the traditional approach f</w:t>
+        <w:t>That last row is a genuine trade-off, not just an advantage for pipelines. While building this case study, seeing the imputed and encoded dataframes as separate, inspectable objects is exactly what made it possible to notice, and fix, the leakage bug described in Section 3, a mistake that would have been easier to miss inside a pipeline's hidden intermediate steps. Pipelines remove a category of mistakes at the cost of some of that step-by-step visibility: prototype and debug with the traditional approach f</w:t>
       </w:r>
       <w:r>
         <w:rPr>
@@ -2983,16 +3192,16 @@
         <w:pStyle w:val="Heading1"/>
         <w:spacing w:before="400" w:after="200"/>
       </w:pPr>
-      <w:bookmarkStart w:id="11" w:name="_Toc239080357"/>
+      <w:bookmarkStart w:id="12" w:name="_Toc239093815"/>
       <w:r>
         <w:rPr>
           <w:b/>
           <w:bCs/>
           <w:color w:val="8B4513"/>
         </w:rPr>
-        <w:t>8. Practical Guidance</w:t>
-      </w:r>
-      <w:bookmarkEnd w:id="11"/>
+        <w:t>9. Practical Guidance</w:t>
+      </w:r>
+      <w:bookmarkEnd w:id="12"/>
     </w:p>
     <w:p>
       <w:pPr>
@@ -3093,6 +3302,7 @@
           <w:sz w:val="23"/>
           <w:szCs w:val="23"/>
         </w:rPr>
+        <w:lastRenderedPageBreak/>
         <w:t>Prefer tuning the whole pipeline with GridSearchCV over tuning the model alone, especially once any step in the pipeline learns something from training data.</w:t>
       </w:r>
     </w:p>
@@ -3101,7 +3311,7 @@
         <w:pStyle w:val="Heading1"/>
         <w:spacing w:before="400" w:after="200"/>
       </w:pPr>
-      <w:bookmarkStart w:id="12" w:name="_Toc239080358"/>
+      <w:bookmarkStart w:id="13" w:name="_Toc239093816"/>
       <w:r>
         <w:rPr>
           <w:b/>
@@ -3110,23 +3320,23 @@
         </w:rPr>
         <w:t>Summary Cheat Sheet</w:t>
       </w:r>
-      <w:bookmarkEnd w:id="12"/>
+      <w:bookmarkEnd w:id="13"/>
     </w:p>
     <w:p>
       <w:pPr>
         <w:pStyle w:val="Heading2"/>
         <w:spacing w:before="300" w:after="150"/>
       </w:pPr>
-      <w:bookmarkStart w:id="13" w:name="_Toc239080359"/>
+      <w:bookmarkStart w:id="14" w:name="_Toc239093817"/>
       <w:r>
         <w:rPr>
           <w:b/>
           <w:bCs/>
           <w:color w:val="1F4E79"/>
         </w:rPr>
-        <w:t>What a Pipeline Is</w:t>
-      </w:r>
-      <w:bookmarkEnd w:id="13"/>
+        <w:t>Data Leakage</w:t>
+      </w:r>
+      <w:bookmarkEnd w:id="14"/>
     </w:p>
     <w:p>
       <w:pPr>
@@ -3142,8 +3352,7 @@
           <w:sz w:val="23"/>
           <w:szCs w:val="23"/>
         </w:rPr>
-        <w:lastRenderedPageBreak/>
-        <w:t>A single object chaining transformers (steps with fit/transform) and a final model (fit/predict).</w:t>
+        <w:t>Any statistic learned from data (mean, median, mode, category frequency) must be fit on the training split only.</w:t>
       </w:r>
     </w:p>
     <w:p>
@@ -3160,7 +3369,7 @@
           <w:sz w:val="23"/>
           <w:szCs w:val="23"/>
         </w:rPr>
-        <w:t>make_pipeline(...) auto-names each step from its class name, lowercased.</w:t>
+        <w:t>Split first, always, before imputing, encoding, or scaling, not just before modeling.</w:t>
       </w:r>
     </w:p>
     <w:p>
@@ -3168,16 +3377,16 @@
         <w:pStyle w:val="Heading2"/>
         <w:spacing w:before="300" w:after="150"/>
       </w:pPr>
-      <w:bookmarkStart w:id="14" w:name="_Toc239080360"/>
+      <w:bookmarkStart w:id="15" w:name="_Toc239093818"/>
       <w:r>
         <w:rPr>
           <w:b/>
           <w:bCs/>
           <w:color w:val="1F4E79"/>
         </w:rPr>
-        <w:t>Building Blocks Used Here</w:t>
-      </w:r>
-      <w:bookmarkEnd w:id="14"/>
+        <w:t>What a Pipeline Is</w:t>
+      </w:r>
+      <w:bookmarkEnd w:id="15"/>
     </w:p>
     <w:p>
       <w:pPr>
@@ -3193,7 +3402,7 @@
           <w:sz w:val="23"/>
           <w:szCs w:val="23"/>
         </w:rPr>
-        <w:t>FunctionTransformer(your_function) — wraps a plain function as a pipeline step, no class needed.</w:t>
+        <w:t>A single object chaining transformers (steps with fit/transform) and a final model (fit/predict).</w:t>
       </w:r>
     </w:p>
     <w:p>
@@ -3210,8 +3419,24 @@
           <w:sz w:val="23"/>
           <w:szCs w:val="23"/>
         </w:rPr>
-        <w:t>SimpleImputer(strategy=...) — fills missing values ("median", "most_frequent", etc.).</w:t>
-      </w:r>
+        <w:t>make_pipeline(...) auto-names each step from its class name, lowercased.</w:t>
+      </w:r>
+    </w:p>
+    <w:p>
+      <w:pPr>
+        <w:pStyle w:val="Heading2"/>
+        <w:spacing w:before="300" w:after="150"/>
+      </w:pPr>
+      <w:bookmarkStart w:id="16" w:name="_Toc239093819"/>
+      <w:r>
+        <w:rPr>
+          <w:b/>
+          <w:bCs/>
+          <w:color w:val="1F4E79"/>
+        </w:rPr>
+        <w:t>Building Blocks Used Here</w:t>
+      </w:r>
+      <w:bookmarkEnd w:id="16"/>
     </w:p>
     <w:p>
       <w:pPr>
@@ -3227,7 +3452,7 @@
           <w:sz w:val="23"/>
           <w:szCs w:val="23"/>
         </w:rPr>
-        <w:t>OneHotEncoder(drop="first") — turns categorical columns into 0/1 columns.</w:t>
+        <w:t>FunctionTransformer(your_function) — wraps a plain function as a pipeline step, no class needed.</w:t>
       </w:r>
     </w:p>
     <w:p>
@@ -3244,24 +3469,8 @@
           <w:sz w:val="23"/>
           <w:szCs w:val="23"/>
         </w:rPr>
-        <w:t>ColumnTransformer([...]) — routes different columns to different preprocessing.</w:t>
-      </w:r>
-    </w:p>
-    <w:p>
-      <w:pPr>
-        <w:pStyle w:val="Heading2"/>
-        <w:spacing w:before="300" w:after="150"/>
-      </w:pPr>
-      <w:bookmarkStart w:id="15" w:name="_Toc239080361"/>
-      <w:r>
-        <w:rPr>
-          <w:b/>
-          <w:bCs/>
-          <w:color w:val="1F4E79"/>
-        </w:rPr>
-        <w:t>Tuning</w:t>
-      </w:r>
-      <w:bookmarkEnd w:id="15"/>
+        <w:t>SimpleImputer(strategy=...) — fills missing values ("median", "most_frequent", etc.).</w:t>
+      </w:r>
     </w:p>
     <w:p>
       <w:pPr>
@@ -3277,7 +3486,7 @@
           <w:sz w:val="23"/>
           <w:szCs w:val="23"/>
         </w:rPr>
-        <w:t>Address a pipeline step's parameter as stepname__parameter in a GridSearchCV param_grid.</w:t>
+        <w:t>OneHotEncoder(drop="first") — turns categorical columns into 0/1 columns.</w:t>
       </w:r>
     </w:p>
     <w:p>
@@ -3294,7 +3503,7 @@
           <w:sz w:val="23"/>
           <w:szCs w:val="23"/>
         </w:rPr>
-        <w:t>Tuning the whole pipeline (not just the model) keeps every fold's preprocessing fit fresh.</w:t>
+        <w:t>ColumnTransformer([...]) — routes different columns to different preprocessing.</w:t>
       </w:r>
     </w:p>
     <w:p>
@@ -3302,16 +3511,16 @@
         <w:pStyle w:val="Heading2"/>
         <w:spacing w:before="300" w:after="150"/>
       </w:pPr>
-      <w:bookmarkStart w:id="16" w:name="_Toc239080362"/>
+      <w:bookmarkStart w:id="17" w:name="_Toc239093820"/>
       <w:r>
         <w:rPr>
           <w:b/>
           <w:bCs/>
           <w:color w:val="1F4E79"/>
         </w:rPr>
-        <w:t>The One Thing to Verify</w:t>
-      </w:r>
-      <w:bookmarkEnd w:id="16"/>
+        <w:t>Tuning</w:t>
+      </w:r>
+      <w:bookmarkEnd w:id="17"/>
     </w:p>
     <w:p>
       <w:pPr>
@@ -3327,7 +3536,24 @@
           <w:sz w:val="23"/>
           <w:szCs w:val="23"/>
         </w:rPr>
-        <w:t>A packaged pipeline should reproduce the manually-built, selected model's numbers exactly, confirm this, don't assume it.</w:t>
+        <w:t>Address a pipeline step's parameter as stepname__parameter in a GridSearchCV param_grid.</w:t>
+      </w:r>
+    </w:p>
+    <w:p>
+      <w:pPr>
+        <w:pStyle w:val="ListParagraph"/>
+        <w:numPr>
+          <w:ilvl w:val="0"/>
+          <w:numId w:val="1"/>
+        </w:numPr>
+        <w:spacing w:after="100" w:line="300" w:lineRule="auto"/>
+      </w:pPr>
+      <w:r>
+        <w:rPr>
+          <w:sz w:val="23"/>
+          <w:szCs w:val="23"/>
+        </w:rPr>
+        <w:t>Tuning the whole pipeline (not just the model) keeps every fold's preprocessing fit fresh.</w:t>
       </w:r>
     </w:p>
     <w:p>
@@ -3335,16 +3561,49 @@
         <w:pStyle w:val="Heading2"/>
         <w:spacing w:before="300" w:after="150"/>
       </w:pPr>
-      <w:bookmarkStart w:id="17" w:name="_Toc239080363"/>
+      <w:bookmarkStart w:id="18" w:name="_Toc239093821"/>
       <w:r>
         <w:rPr>
           <w:b/>
           <w:bCs/>
           <w:color w:val="1F4E79"/>
         </w:rPr>
+        <w:t>The One Thing to Verify</w:t>
+      </w:r>
+      <w:bookmarkEnd w:id="18"/>
+    </w:p>
+    <w:p>
+      <w:pPr>
+        <w:pStyle w:val="ListParagraph"/>
+        <w:numPr>
+          <w:ilvl w:val="0"/>
+          <w:numId w:val="1"/>
+        </w:numPr>
+        <w:spacing w:after="100" w:line="300" w:lineRule="auto"/>
+      </w:pPr>
+      <w:r>
+        <w:rPr>
+          <w:sz w:val="23"/>
+          <w:szCs w:val="23"/>
+        </w:rPr>
+        <w:t>A packaged pipeline should reproduce the manually-built, selected model's numbers exactly, confirm this, don't assume it.</w:t>
+      </w:r>
+    </w:p>
+    <w:p>
+      <w:pPr>
+        <w:pStyle w:val="Heading2"/>
+        <w:spacing w:before="300" w:after="150"/>
+      </w:pPr>
+      <w:bookmarkStart w:id="19" w:name="_Toc239093822"/>
+      <w:r>
+        <w:rPr>
+          <w:b/>
+          <w:bCs/>
+          <w:color w:val="1F4E79"/>
+        </w:rPr>
         <w:t>Traditional vs. Pipeline</w:t>
       </w:r>
-      <w:bookmarkEnd w:id="17"/>
+      <w:bookmarkEnd w:id="19"/>
     </w:p>
     <w:p>
       <w:pPr>
@@ -3393,10 +3652,10 @@
 <file path=word/numbering.xml><?xml version="1.0" encoding="utf-8"?>
 <w:numbering xmlns:wpc="http://schemas.microsoft.com/office/word/2010/wordprocessingCanvas" xmlns:cx="http://schemas.microsoft.com/office/drawing/2014/chartex" xmlns:cx1="http://schemas.microsoft.com/office/drawing/2015/9/8/chartex" xmlns:cx2="http://schemas.microsoft.com/office/drawing/2015/10/21/chartex" xmlns:cx3="http://schemas.microsoft.com/office/drawing/2016/5/9/chartex" xmlns:cx4="http://schemas.microsoft.com/office/drawing/2016/5/10/chartex" xmlns:cx5="http://schemas.microsoft.com/office/drawing/2016/5/11/chartex" xmlns:cx6="http://schemas.microsoft.com/office/drawing/2016/5/12/chartex" xmlns:cx7="http://schemas.microsoft.com/office/drawing/2016/5/13/chartex" xmlns:cx8="http://schemas.microsoft.com/office/drawing/2016/5/14/chartex" xmlns:mc="http://schemas.openxmlformats.org/markup-compatibility/2006" xmlns:aink="http://schemas.microsoft.com/office/drawing/2016/ink" xmlns:am3d="http://schemas.microsoft.com/office/drawing/2017/model3d" xmlns:o="urn:schemas-microsoft-com:office:office" xmlns:oel="http://schemas.microsoft.com/office/2019/extlst" xmlns:r="http://schemas.openxmlformats.org/officeDocument/2006/relationships" xmlns:m="http://schemas.openxmlformats.org/officeDocument/2006/math" xmlns:v="urn:schemas-microsoft-com:vml" xmlns:wp14="http://schemas.microsoft.com/office/word/2010/wordprocessingDrawing" xmlns:wp="http://schemas.openxmlformats.org/drawingml/2006/wordprocessingDrawing" xmlns:w10="urn:schemas-microsoft-com:office:word" xmlns:w="http://schemas.openxmlformats.org/wordprocessingml/2006/main" xmlns:w14="http://schemas.microsoft.com/office/word/2010/wordml" xmlns:w15="http://schemas.microsoft.com/office/word/2012/wordml" xmlns:w16cex="http://schemas.microsoft.com/office/word/2018/wordml/cex" xmlns:w16cid="http://schemas.microsoft.com/office/word/2016/wordml/cid" xmlns:w16="http://schemas.microsoft.com/office/word/2018/wordml" xmlns:w16du="http://schemas.microsoft.com/office/word/2023/wordml/word16du" xmlns:w16sdtdh="http://schemas.microsoft.com/office/word/2020/wordml/sdtdatahash" xmlns:w16sdtfl="http://schemas.microsoft.com/office/word/2024/wordml/sdtformatlock" xmlns:w16se="http://schemas.microsoft.com/office/word/2015/wordml/symex" xmlns:wpg="http://schemas.microsoft.com/office/word/2010/wordprocessingGroup" xmlns:wpi="http://schemas.microsoft.com/office/word/2010/wordprocessingInk" xmlns:wne="http://schemas.microsoft.com/office/word/2006/wordml" xmlns:wps="http://schemas.microsoft.com/office/word/2010/wordprocessingShape" mc:Ignorable="w14 w15 w16se w16cid w16 w16cex w16sdtdh w16sdtfl w16du wp14">
   <w:abstractNum w:abstractNumId="0" w15:restartNumberingAfterBreak="0">
-    <w:nsid w:val="71AD43DC"/>
+    <w:nsid w:val="10664301"/>
     <w:multiLevelType w:val="hybridMultilevel"/>
-    <w:tmpl w:val="7D405EB2"/>
-    <w:lvl w:ilvl="0" w:tplc="6E24CDFA">
+    <w:tmpl w:val="3D22C188"/>
+    <w:lvl w:ilvl="0" w:tplc="070476E0">
       <w:start w:val="1"/>
       <w:numFmt w:val="bullet"/>
       <w:lvlText w:val="●"/>
@@ -3405,7 +3664,7 @@
         <w:ind w:left="720" w:hanging="360"/>
       </w:pPr>
     </w:lvl>
-    <w:lvl w:ilvl="1" w:tplc="67825168">
+    <w:lvl w:ilvl="1" w:tplc="E7C4FE00">
       <w:start w:val="1"/>
       <w:numFmt w:val="bullet"/>
       <w:lvlText w:val="○"/>
@@ -3414,7 +3673,7 @@
         <w:ind w:left="1440" w:hanging="360"/>
       </w:pPr>
     </w:lvl>
-    <w:lvl w:ilvl="2" w:tplc="6414E7A4">
+    <w:lvl w:ilvl="2" w:tplc="F612ACB8">
       <w:start w:val="1"/>
       <w:numFmt w:val="bullet"/>
       <w:lvlText w:val="■"/>
@@ -3423,7 +3682,7 @@
         <w:ind w:left="2160" w:hanging="360"/>
       </w:pPr>
     </w:lvl>
-    <w:lvl w:ilvl="3" w:tplc="0838C756">
+    <w:lvl w:ilvl="3" w:tplc="BDFE3ECC">
       <w:start w:val="1"/>
       <w:numFmt w:val="bullet"/>
       <w:lvlText w:val="●"/>
@@ -3432,7 +3691,7 @@
         <w:ind w:left="2880" w:hanging="360"/>
       </w:pPr>
     </w:lvl>
-    <w:lvl w:ilvl="4" w:tplc="CD7457F2">
+    <w:lvl w:ilvl="4" w:tplc="881C1A74">
       <w:start w:val="1"/>
       <w:numFmt w:val="bullet"/>
       <w:lvlText w:val="○"/>
@@ -3441,7 +3700,7 @@
         <w:ind w:left="3600" w:hanging="360"/>
       </w:pPr>
     </w:lvl>
-    <w:lvl w:ilvl="5" w:tplc="43881960">
+    <w:lvl w:ilvl="5" w:tplc="4AE6C5F4">
       <w:start w:val="1"/>
       <w:numFmt w:val="bullet"/>
       <w:lvlText w:val="■"/>
@@ -3450,7 +3709,7 @@
         <w:ind w:left="4320" w:hanging="360"/>
       </w:pPr>
     </w:lvl>
-    <w:lvl w:ilvl="6" w:tplc="F6A6E300">
+    <w:lvl w:ilvl="6" w:tplc="A89CD866">
       <w:start w:val="1"/>
       <w:numFmt w:val="bullet"/>
       <w:lvlText w:val="●"/>
@@ -3459,7 +3718,7 @@
         <w:ind w:left="5040" w:hanging="360"/>
       </w:pPr>
     </w:lvl>
-    <w:lvl w:ilvl="7" w:tplc="235CDDE2">
+    <w:lvl w:ilvl="7" w:tplc="5A0AA6CA">
       <w:start w:val="1"/>
       <w:numFmt w:val="bullet"/>
       <w:lvlText w:val="●"/>
@@ -3468,7 +3727,7 @@
         <w:ind w:left="5760" w:hanging="360"/>
       </w:pPr>
     </w:lvl>
-    <w:lvl w:ilvl="8" w:tplc="D6EA5676">
+    <w:lvl w:ilvl="8" w:tplc="04B4DEBE">
       <w:start w:val="1"/>
       <w:numFmt w:val="bullet"/>
       <w:lvlText w:val="●"/>
@@ -3478,7 +3737,7 @@
       </w:pPr>
     </w:lvl>
   </w:abstractNum>
-  <w:num w:numId="1" w16cid:durableId="988900939">
+  <w:num w:numId="1" w16cid:durableId="323630304">
     <w:abstractNumId w:val="0"/>
     <w:lvlOverride w:ilvl="0">
       <w:startOverride w:val="1"/>
@@ -4081,7 +4340,7 @@
     <w:autoRedefine/>
     <w:uiPriority w:val="39"/>
     <w:unhideWhenUsed/>
-    <w:rsid w:val="000F7B32"/>
+    <w:rsid w:val="00DB0CC1"/>
     <w:pPr>
       <w:spacing w:after="100"/>
     </w:pPr>
@@ -4093,7 +4352,7 @@
     <w:autoRedefine/>
     <w:uiPriority w:val="39"/>
     <w:unhideWhenUsed/>
-    <w:rsid w:val="000F7B32"/>
+    <w:rsid w:val="00DB0CC1"/>
     <w:pPr>
       <w:spacing w:after="100"/>
       <w:ind w:left="200"/>

</xml_diff>